<commit_message>
Update docs and generate-docs script; ignore office lock files
</commit_message>
<xml_diff>
--- a/finalAWP/my-app/docs/relatorio.docx
+++ b/finalAWP/my-app/docs/relatorio.docx
@@ -54,7 +54,7 @@
           <w:sz w:val="28"/>
           <w:szCs w:val="28"/>
         </w:rPr>
-        <w:t xml:space="preserve">[Nome da Universidade]</w:t>
+        <w:t xml:space="preserve">ISLA Gaia</w:t>
       </w:r>
     </w:p>
     <w:p>
@@ -68,7 +68,7 @@
           <w:sz w:val="24"/>
           <w:szCs w:val="24"/>
         </w:rPr>
-        <w:t xml:space="preserve">[Departamento / Escola]</w:t>
+        <w:t xml:space="preserve">Information Systems and Technologies</w:t>
       </w:r>
     </w:p>
     <w:p>
@@ -110,7 +110,7 @@
           <w:sz w:val="32"/>
           <w:szCs w:val="32"/>
         </w:rPr>
-        <w:t xml:space="preserve">Next.js: Investigacao e Desenvolvimento de uma Aplicacao Web</w:t>
+        <w:t xml:space="preserve">Next.js: Research and Development of a Web Application</w:t>
       </w:r>
     </w:p>
     <w:p>
@@ -139,7 +139,7 @@
           <w:sz w:val="26"/>
           <w:szCs w:val="26"/>
         </w:rPr>
-        <w:t xml:space="preserve">Trabalho Pratico – Advanced Web Programming</w:t>
+        <w:t xml:space="preserve">Practical Assignment – Advanced Web Programming</w:t>
       </w:r>
     </w:p>
     <w:p>
@@ -179,7 +179,7 @@
           <w:sz w:val="24"/>
           <w:szCs w:val="24"/>
         </w:rPr>
-        <w:t xml:space="preserve">[Nome do Estudante 1]  |  N. XXXXXX</w:t>
+        <w:t xml:space="preserve">Raphael Malburg  |  a22500074</w:t>
       </w:r>
     </w:p>
     <w:p>
@@ -193,7 +193,7 @@
           <w:sz w:val="24"/>
           <w:szCs w:val="24"/>
         </w:rPr>
-        <w:t xml:space="preserve">[Nome do Estudante 2]  |  N. XXXXXX</w:t>
+        <w:t xml:space="preserve">Andre Neves  |  a22508912</w:t>
       </w:r>
     </w:p>
     <w:p>
@@ -220,7 +220,7 @@
           <w:sz w:val="24"/>
           <w:szCs w:val="24"/>
         </w:rPr>
-        <w:t xml:space="preserve">Docente: [Nome do/a Docente]</w:t>
+        <w:t xml:space="preserve">Lecturer: Jose Joaquim Magalhaes Moreira</w:t>
       </w:r>
     </w:p>
     <w:p>
@@ -260,7 +260,7 @@
           <w:sz w:val="24"/>
           <w:szCs w:val="24"/>
         </w:rPr>
-        <w:t xml:space="preserve">2025/2026 - 1. Semestre</w:t>
+        <w:t xml:space="preserve">2025/2026 - 1st Semester</w:t>
       </w:r>
     </w:p>
     <w:p>
@@ -274,7 +274,7 @@
           <w:sz w:val="24"/>
           <w:szCs w:val="24"/>
         </w:rPr>
-        <w:t xml:space="preserve">Maio de 2026</w:t>
+        <w:t xml:space="preserve">May 2026</w:t>
       </w:r>
     </w:p>
     <w:p>
@@ -295,7 +295,7 @@
           <w:sz w:val="28"/>
           <w:szCs w:val="28"/>
         </w:rPr>
-        <w:t xml:space="preserve">Resumo</w:t>
+        <w:t xml:space="preserve">Abstract</w:t>
       </w:r>
     </w:p>
     <w:p>
@@ -309,7 +309,7 @@
           <w:sz w:val="24"/>
           <w:szCs w:val="24"/>
         </w:rPr>
-        <w:t xml:space="preserve">O presente trabalho, desenvolvido no ambito da unidade curricular de Advanced Web Programming, tem como objetivo investigar o framework Next.js, desenvolvido pela Vercel, analisando o seu estado da arte, vantagens, desvantagens e principais areas de utilizacao. Paralelamente, e apresentada uma aplicacao web de demonstracao denominada Market Dashboard, desenvolvida com o mesmo framework, que ilustra as suas capacidades no contexto de visualizacao de dados financeiros em tempo real. A aplicacao integra a API nao oficial do Yahoo Finance, apresenta graficos de candlestick com selecao de timeframe e suporta indicadores tecnicos configurAveis, servindo como prova de conceito das funcionalidades do Next.js em ambiente de producao.</w:t>
+        <w:t xml:space="preserve">This work, developed within the scope of the Advanced Web Programming course, aims to investigate the Next.js framework created by Vercel, analysing its state of the art, advantages, disadvantages and main areas of use. Alongside the research, a demonstration web application called Market Dashboard was developed using the same framework, illustrating its capabilities in the context of real-time financial data visualisation. The application integrates the unofficial Yahoo Finance API, presents candlestick charts with timeframe selection, and supports configurable technical indicators, serving as a proof of concept for Next.js features in a production-like environment.</w:t>
       </w:r>
     </w:p>
     <w:p>
@@ -338,15 +338,15 @@
           <w:sz w:val="24"/>
           <w:szCs w:val="24"/>
         </w:rPr>
-        <w:t xml:space="preserve">Palavras-chave: </w:t>
-      </w:r>
-      <w:r>
-        <w:rPr>
-          <w:rFonts w:ascii="Times New Roman" w:cs="Times New Roman" w:eastAsia="Times New Roman" w:hAnsi="Times New Roman"/>
-          <w:sz w:val="24"/>
-          <w:szCs w:val="24"/>
-        </w:rPr>
-        <w:t xml:space="preserve">Next.js, React, framework web, renderizacao hibrida, aplicacao web, visualizacao financeira.</w:t>
+        <w:t xml:space="preserve">Keywords: </w:t>
+      </w:r>
+      <w:r>
+        <w:rPr>
+          <w:rFonts w:ascii="Times New Roman" w:cs="Times New Roman" w:eastAsia="Times New Roman" w:hAnsi="Times New Roman"/>
+          <w:sz w:val="24"/>
+          <w:szCs w:val="24"/>
+        </w:rPr>
+        <w:t xml:space="preserve">Next.js, React, web framework, hybrid rendering, web application, financial visualisation.</w:t>
       </w:r>
     </w:p>
     <w:p>
@@ -367,7 +367,7 @@
           <w:sz w:val="28"/>
           <w:szCs w:val="28"/>
         </w:rPr>
-        <w:t xml:space="preserve">Indice</w:t>
+        <w:t xml:space="preserve">Table of Contents</w:t>
       </w:r>
     </w:p>
     <w:p>
@@ -381,7 +381,7 @@
           <w:sz w:val="24"/>
           <w:szCs w:val="24"/>
         </w:rPr>
-        <w:t xml:space="preserve">Nota: No Microsoft Word, clique com o botao direito sobre o indice e selecione "Atualizar Campo" para gerar a numeracao de paginas.</w:t>
+        <w:t xml:space="preserve">Note: In Microsoft Word, right-click the table of contents and select "Update Field" to generate page numbers.</w:t>
       </w:r>
     </w:p>
     <w:p>
@@ -390,7 +390,7 @@
       </w:pPr>
       <w:sdt>
         <w:sdtPr>
-          <w:alias w:val="Indice"/>
+          <w:alias w:val="Table of Contents"/>
         </w:sdtPr>
         <w:sdtContent>
           <w:p>
@@ -426,7 +426,7 @@
           <w:sz w:val="28"/>
           <w:szCs w:val="28"/>
         </w:rPr>
-        <w:t xml:space="preserve">Lista de Figuras e Tabelas</w:t>
+        <w:t xml:space="preserve">List of Figures and Tables</w:t>
       </w:r>
     </w:p>
     <w:p>
@@ -455,7 +455,7 @@
           <w:sz w:val="24"/>
           <w:szCs w:val="24"/>
         </w:rPr>
-        <w:t xml:space="preserve">Figuras</w:t>
+        <w:t xml:space="preserve">Figures</w:t>
       </w:r>
     </w:p>
     <w:p>
@@ -469,7 +469,7 @@
           <w:sz w:val="24"/>
           <w:szCs w:val="24"/>
         </w:rPr>
-        <w:t xml:space="preserve">Figura 1 – Arquitetura de renderizacao hibrida do Next.js ................ 5</w:t>
+        <w:t xml:space="preserve">Figure 1 – Next.js hybrid rendering architecture ........................... 5</w:t>
       </w:r>
     </w:p>
     <w:p>
@@ -483,7 +483,7 @@
           <w:sz w:val="24"/>
           <w:szCs w:val="24"/>
         </w:rPr>
-        <w:t xml:space="preserve">Figura 2 – Comparacao de abordagens de renderizacao (CSR vs SSR vs SSG) . 6</w:t>
+        <w:t xml:space="preserve">Figure 2 – Rendering approach comparison (CSR vs SSR vs SSG) .............. 6</w:t>
       </w:r>
     </w:p>
     <w:p>
@@ -497,7 +497,7 @@
           <w:sz w:val="24"/>
           <w:szCs w:val="24"/>
         </w:rPr>
-        <w:t xml:space="preserve">Figura 3 – Estrutura de pastas da aplicacao Market Dashboard ............. 9</w:t>
+        <w:t xml:space="preserve">Figure 3 – Market Dashboard application folder structure ................... 9</w:t>
       </w:r>
     </w:p>
     <w:p>
@@ -511,7 +511,7 @@
           <w:sz w:val="24"/>
           <w:szCs w:val="24"/>
         </w:rPr>
-        <w:t xml:space="preserve">Figura 4 – Interface do dashboard de mercado ............................. 10</w:t>
+        <w:t xml:space="preserve">Figure 4 – Market dashboard interface ...................................... 10</w:t>
       </w:r>
     </w:p>
     <w:p>
@@ -525,7 +525,7 @@
           <w:sz w:val="24"/>
           <w:szCs w:val="24"/>
         </w:rPr>
-        <w:t xml:space="preserve">Figura 5 – Grafico de candlestick com indicadores tecnicos .............. 11</w:t>
+        <w:t xml:space="preserve">Figure 5 – Candlestick chart with technical indicators ..................... 11</w:t>
       </w:r>
     </w:p>
     <w:p>
@@ -554,7 +554,7 @@
           <w:sz w:val="24"/>
           <w:szCs w:val="24"/>
         </w:rPr>
-        <w:t xml:space="preserve">Tabelas</w:t>
+        <w:t xml:space="preserve">Tables</w:t>
       </w:r>
     </w:p>
     <w:p>
@@ -568,7 +568,7 @@
           <w:sz w:val="24"/>
           <w:szCs w:val="24"/>
         </w:rPr>
-        <w:t xml:space="preserve">Tabela 1 – Comparacao de frameworks: Next.js vs alternativas ............. 7</w:t>
+        <w:t xml:space="preserve">Table 1 – Framework comparison: Next.js vs alternatives .................... 7</w:t>
       </w:r>
     </w:p>
     <w:p>
@@ -582,7 +582,7 @@
           <w:sz w:val="24"/>
           <w:szCs w:val="24"/>
         </w:rPr>
-        <w:t xml:space="preserve">Tabela 2 – Tecnologias utilizadas na implementacao ........................ 9</w:t>
+        <w:t xml:space="preserve">Table 2 – Technologies used in the implementation .......................... 9</w:t>
       </w:r>
     </w:p>
     <w:p>
@@ -596,7 +596,7 @@
           <w:sz w:val="24"/>
           <w:szCs w:val="24"/>
         </w:rPr>
-        <w:t xml:space="preserve">Tabela 3 – Endpoints da API interna ..................................... 10</w:t>
+        <w:t xml:space="preserve">Table 3 – Internal API endpoints ........................................... 10</w:t>
       </w:r>
     </w:p>
     <w:p>
@@ -617,7 +617,7 @@
           <w:sz w:val="28"/>
           <w:szCs w:val="28"/>
         </w:rPr>
-        <w:t xml:space="preserve">1. Introducao</w:t>
+        <w:t xml:space="preserve">1. Introduction</w:t>
       </w:r>
     </w:p>
     <w:p>
@@ -631,7 +631,7 @@
           <w:sz w:val="24"/>
           <w:szCs w:val="24"/>
         </w:rPr>
-        <w:t xml:space="preserve">O desenvolvimento de aplicacoes web tem evoluido a um ritmo acelerado nas ultimas duas decadas, impulsionado pela crescente exigencia de experiencias de utilizador rapidas, acessiveis e dinamicas. Neste contexto, os frameworks web emergem como ferramentas fundamentais para organizar e abstrair a complexidade do desenvolvimento, permitindo que as equipas se concentrem na logica de negocio em vez de resolver problemas de infraestrutura de forma repetida.</w:t>
+        <w:t xml:space="preserve">Web application development has evolved at an accelerated pace over the last two decades, driven by increasing demands for fast, accessible, and dynamic user experiences. In this context, web frameworks emerge as fundamental tools for organising and abstracting development complexity, allowing teams to focus on business logic instead of solving infrastructure problems repeatedly.</w:t>
       </w:r>
     </w:p>
     <w:p>
@@ -645,7 +645,7 @@
           <w:sz w:val="24"/>
           <w:szCs w:val="24"/>
         </w:rPr>
-        <w:t xml:space="preserve">O presente trabalho debruca-se sobre o Next.js, um framework React de codigo aberto criado pela Vercel em 2016, que se tem destacado pelo seu modelo de renderizacao hibrida, capaz de combinar renderizacao no servidor (Server-Side Rendering, SSR), geracao de conteudo estatico (Static Site Generation, SSG) e renderizacao no cliente (Client-Side Rendering, CSR) numa unica aplicacao. Este modelo confere ao Next.js uma flexibilidade singular no panorama dos frameworks web modernos.</w:t>
+        <w:t xml:space="preserve">This work focuses on Next.js, an open-source React framework created by Vercel in 2016, which has distinguished itself through its hybrid rendering model, capable of combining Server-Side Rendering (SSR), Static Site Generation (SSG), and Client-Side Rendering (CSR) within a single application. This model gives Next.js unique flexibility in the landscape of modern web frameworks.</w:t>
       </w:r>
     </w:p>
     <w:p>
@@ -661,83 +661,83 @@
           <w:sz w:val="26"/>
           <w:szCs w:val="26"/>
         </w:rPr>
-        <w:t xml:space="preserve">1.1 Objetivos</w:t>
-      </w:r>
-    </w:p>
-    <w:p>
-      <w:pPr>
-        <w:pStyle w:val="ListParagraph"/>
-        <w:numPr>
-          <w:ilvl w:val="0"/>
-          <w:numId w:val="1"/>
-        </w:numPr>
-        <w:spacing w:after="100" w:line="276" w:lineRule="auto"/>
-        <w:jc w:val="both"/>
-      </w:pPr>
-      <w:r>
-        <w:rPr>
-          <w:rFonts w:ascii="Times New Roman" w:cs="Times New Roman" w:eastAsia="Times New Roman" w:hAnsi="Times New Roman"/>
-          <w:sz w:val="24"/>
-          <w:szCs w:val="24"/>
-        </w:rPr>
-        <w:t xml:space="preserve">Investigar o estado da arte do Next.js, incluindo a sua historia, arquitetura e ecossistema;</w:t>
-      </w:r>
-    </w:p>
-    <w:p>
-      <w:pPr>
-        <w:pStyle w:val="ListParagraph"/>
-        <w:numPr>
-          <w:ilvl w:val="0"/>
-          <w:numId w:val="1"/>
-        </w:numPr>
-        <w:spacing w:after="100" w:line="276" w:lineRule="auto"/>
-        <w:jc w:val="both"/>
-      </w:pPr>
-      <w:r>
-        <w:rPr>
-          <w:rFonts w:ascii="Times New Roman" w:cs="Times New Roman" w:eastAsia="Times New Roman" w:hAnsi="Times New Roman"/>
-          <w:sz w:val="24"/>
-          <w:szCs w:val="24"/>
-        </w:rPr>
-        <w:t xml:space="preserve">Identificar as vantagens, desvantagens e principais areas de utilizacao do framework;</w:t>
-      </w:r>
-    </w:p>
-    <w:p>
-      <w:pPr>
-        <w:pStyle w:val="ListParagraph"/>
-        <w:numPr>
-          <w:ilvl w:val="0"/>
-          <w:numId w:val="1"/>
-        </w:numPr>
-        <w:spacing w:after="100" w:line="276" w:lineRule="auto"/>
-        <w:jc w:val="both"/>
-      </w:pPr>
-      <w:r>
-        <w:rPr>
-          <w:rFonts w:ascii="Times New Roman" w:cs="Times New Roman" w:eastAsia="Times New Roman" w:hAnsi="Times New Roman"/>
-          <w:sz w:val="24"/>
-          <w:szCs w:val="24"/>
-        </w:rPr>
-        <w:t xml:space="preserve">Avaliar a experiencia de desenvolvimento com Next.js e os seus beneficios praticos;</w:t>
-      </w:r>
-    </w:p>
-    <w:p>
-      <w:pPr>
-        <w:pStyle w:val="ListParagraph"/>
-        <w:numPr>
-          <w:ilvl w:val="0"/>
-          <w:numId w:val="1"/>
-        </w:numPr>
-        <w:spacing w:after="100" w:line="276" w:lineRule="auto"/>
-        <w:jc w:val="both"/>
-      </w:pPr>
-      <w:r>
-        <w:rPr>
-          <w:rFonts w:ascii="Times New Roman" w:cs="Times New Roman" w:eastAsia="Times New Roman" w:hAnsi="Times New Roman"/>
-          <w:sz w:val="24"/>
-          <w:szCs w:val="24"/>
-        </w:rPr>
-        <w:t xml:space="preserve">Desenvolver uma aplicacao de demonstracao – Market Dashboard – utilizando o framework investigado.</w:t>
+        <w:t xml:space="preserve">1.1 Objectives</w:t>
+      </w:r>
+    </w:p>
+    <w:p>
+      <w:pPr>
+        <w:pStyle w:val="ListParagraph"/>
+        <w:numPr>
+          <w:ilvl w:val="0"/>
+          <w:numId w:val="1"/>
+        </w:numPr>
+        <w:spacing w:after="100" w:line="276" w:lineRule="auto"/>
+        <w:jc w:val="both"/>
+      </w:pPr>
+      <w:r>
+        <w:rPr>
+          <w:rFonts w:ascii="Times New Roman" w:cs="Times New Roman" w:eastAsia="Times New Roman" w:hAnsi="Times New Roman"/>
+          <w:sz w:val="24"/>
+          <w:szCs w:val="24"/>
+        </w:rPr>
+        <w:t xml:space="preserve">Investigate the state of the art of Next.js, including its history, architecture, and ecosystem;</w:t>
+      </w:r>
+    </w:p>
+    <w:p>
+      <w:pPr>
+        <w:pStyle w:val="ListParagraph"/>
+        <w:numPr>
+          <w:ilvl w:val="0"/>
+          <w:numId w:val="1"/>
+        </w:numPr>
+        <w:spacing w:after="100" w:line="276" w:lineRule="auto"/>
+        <w:jc w:val="both"/>
+      </w:pPr>
+      <w:r>
+        <w:rPr>
+          <w:rFonts w:ascii="Times New Roman" w:cs="Times New Roman" w:eastAsia="Times New Roman" w:hAnsi="Times New Roman"/>
+          <w:sz w:val="24"/>
+          <w:szCs w:val="24"/>
+        </w:rPr>
+        <w:t xml:space="preserve">Identify the advantages, disadvantages, and main areas of use of the framework;</w:t>
+      </w:r>
+    </w:p>
+    <w:p>
+      <w:pPr>
+        <w:pStyle w:val="ListParagraph"/>
+        <w:numPr>
+          <w:ilvl w:val="0"/>
+          <w:numId w:val="1"/>
+        </w:numPr>
+        <w:spacing w:after="100" w:line="276" w:lineRule="auto"/>
+        <w:jc w:val="both"/>
+      </w:pPr>
+      <w:r>
+        <w:rPr>
+          <w:rFonts w:ascii="Times New Roman" w:cs="Times New Roman" w:eastAsia="Times New Roman" w:hAnsi="Times New Roman"/>
+          <w:sz w:val="24"/>
+          <w:szCs w:val="24"/>
+        </w:rPr>
+        <w:t xml:space="preserve">Evaluate the development experience with Next.js and its practical benefits;</w:t>
+      </w:r>
+    </w:p>
+    <w:p>
+      <w:pPr>
+        <w:pStyle w:val="ListParagraph"/>
+        <w:numPr>
+          <w:ilvl w:val="0"/>
+          <w:numId w:val="1"/>
+        </w:numPr>
+        <w:spacing w:after="100" w:line="276" w:lineRule="auto"/>
+        <w:jc w:val="both"/>
+      </w:pPr>
+      <w:r>
+        <w:rPr>
+          <w:rFonts w:ascii="Times New Roman" w:cs="Times New Roman" w:eastAsia="Times New Roman" w:hAnsi="Times New Roman"/>
+          <w:sz w:val="24"/>
+          <w:szCs w:val="24"/>
+        </w:rPr>
+        <w:t xml:space="preserve">Develop a demonstration application – Market Dashboard – using the investigated framework.</w:t>
       </w:r>
     </w:p>
     <w:p>
@@ -753,7 +753,7 @@
           <w:sz w:val="26"/>
           <w:szCs w:val="26"/>
         </w:rPr>
-        <w:t xml:space="preserve">1.2 Estrutura do Relatorio</w:t>
+        <w:t xml:space="preserve">1.2 Report Structure</w:t>
       </w:r>
     </w:p>
     <w:p>
@@ -767,7 +767,7 @@
           <w:sz w:val="24"/>
           <w:szCs w:val="24"/>
         </w:rPr>
-        <w:t xml:space="preserve">O relatorio esta organizado da seguinte forma: a Seccao 2 apresenta o estado da arte do Next.js; a Seccao 3 descreve a metodologia de resolucao do problema; a Seccao 4 detalha a implementacao da aplicacao; a Seccao 5 apresenta as conclusoes, dificuldades e melhorias propostas; a Seccao 6 lista as referencias bibliograficas.</w:t>
+        <w:t xml:space="preserve">The report is organised as follows: Section 2 presents the state of the art of Next.js; Section 3 describes the problem-solving methodology; Section 4 details the application implementation; Section 5 presents conclusions, difficulties and proposed improvements; Section 6 lists the bibliographic references.</w:t>
       </w:r>
     </w:p>
     <w:p>
@@ -788,7 +788,7 @@
           <w:sz w:val="28"/>
           <w:szCs w:val="28"/>
         </w:rPr>
-        <w:t xml:space="preserve">2. Estado da Arte – Next.js</w:t>
+        <w:t xml:space="preserve">2. State of the Art – Next.js</w:t>
       </w:r>
     </w:p>
     <w:p>
@@ -804,7 +804,7 @@
           <w:sz w:val="26"/>
           <w:szCs w:val="26"/>
         </w:rPr>
-        <w:t xml:space="preserve">2.1 Historia e Evolucao</w:t>
+        <w:t xml:space="preserve">2.1 History and Evolution</w:t>
       </w:r>
     </w:p>
     <w:p>
@@ -818,7 +818,7 @@
           <w:sz w:val="24"/>
           <w:szCs w:val="24"/>
         </w:rPr>
-        <w:t xml:space="preserve">O Next.js foi lancado publicamente em outubro de 2016 por Guillermo Rauch e a equipa da Vercel (entao denominada Zeit), como resposta a um problema concreto: construir aplicacoes React com renderizacao do lado do servidor de forma simples e sem configuracao manual complexa. A primeira versao introduziu seis principios fundamentais: renderizacao no servidor por defeito, carregamento de codigo por rota, suporte a CSS, hot-reloading em desenvolvimento, ciclo de compilacao simples e configuracao minima (Vercel, Inc., 2026).</w:t>
+        <w:t xml:space="preserve">Next.js was publicly released in October 2016 by Guillermo Rauch and the Vercel team (then called Zeit), as a response to a concrete problem: building React applications with server-side rendering in a simple and uncomplicated way. The first version introduced six core principles: server rendering by default, route-level code loading, CSS support, hot-reloading in development, a simple build cycle, and minimal configuration (Vercel, Inc., 2026).</w:t>
       </w:r>
     </w:p>
     <w:p>
@@ -832,7 +832,7 @@
           <w:sz w:val="24"/>
           <w:szCs w:val="24"/>
         </w:rPr>
-        <w:t xml:space="preserve">Desde entao, o framework tem evoluido de forma consistente. A versao 9 (2019) introduziu o roteamento dinamico automatico; a versao 10 (2020) trouxe otimizacao de imagens integrada; a versao 12 (2021) introduziu o compilador Rust (SWC) e middleware a nivel de borda; a versao 13 (2022) lancou o App Router baseado em React Server Components; a versao 14 (2023) estabilizou o App Router e introduziu Server Actions; a versao 15 e posteriores continuaram a refinar o modelo de componentes e a performance (Vercel, Inc., 2026).</w:t>
+        <w:t xml:space="preserve">Since then, the framework has evolved consistently. Version 9 (2019) introduced automatic dynamic routing; version 10 (2020) brought integrated image optimisation; version 12 (2021) introduced the Rust-based SWC compiler and edge-level middleware; version 13 (2022) launched the App Router based on React Server Components; version 14 (2023) stabilised the App Router and introduced Server Actions; versions 15 and beyond continued to refine the component model and performance (Vercel, Inc., 2026).</w:t>
       </w:r>
     </w:p>
     <w:p>
@@ -848,7 +848,7 @@
           <w:sz w:val="26"/>
           <w:szCs w:val="26"/>
         </w:rPr>
-        <w:t xml:space="preserve">2.2 Arquitetura e Funcionalidades Principais</w:t>
+        <w:t xml:space="preserve">2.2 Architecture and Main Features</w:t>
       </w:r>
     </w:p>
     <w:p>
@@ -862,7 +862,7 @@
           <w:sz w:val="24"/>
           <w:szCs w:val="24"/>
         </w:rPr>
-        <w:t xml:space="preserve">O Next.js baseia-se no React e estende-o com um conjunto de funcionalidades que cobrem tanto o frontend como o backend de uma aplicacao web:</w:t>
+        <w:t xml:space="preserve">Next.js is built on React and extends it with a set of features covering both the frontend and backend of a web application:</w:t>
       </w:r>
     </w:p>
     <w:p>
@@ -880,7 +880,7 @@
           <w:sz w:val="24"/>
           <w:szCs w:val="24"/>
         </w:rPr>
-        <w:t xml:space="preserve">2.2.1 Modelos de Renderizacao</w:t>
+        <w:t xml:space="preserve">2.2.1 Rendering Models</w:t>
       </w:r>
     </w:p>
     <w:p>
@@ -894,83 +894,83 @@
           <w:sz w:val="24"/>
           <w:szCs w:val="24"/>
         </w:rPr>
-        <w:t xml:space="preserve">Uma das caracteristicas mais distintas do Next.js e a sua capacidade de combinar diferentes estrategias de renderizacao na mesma aplicacao:</w:t>
-      </w:r>
-    </w:p>
-    <w:p>
-      <w:pPr>
-        <w:pStyle w:val="ListParagraph"/>
-        <w:numPr>
-          <w:ilvl w:val="0"/>
-          <w:numId w:val="1"/>
-        </w:numPr>
-        <w:spacing w:after="100" w:line="276" w:lineRule="auto"/>
-        <w:jc w:val="both"/>
-      </w:pPr>
-      <w:r>
-        <w:rPr>
-          <w:rFonts w:ascii="Times New Roman" w:cs="Times New Roman" w:eastAsia="Times New Roman" w:hAnsi="Times New Roman"/>
-          <w:sz w:val="24"/>
-          <w:szCs w:val="24"/>
-        </w:rPr>
-        <w:t xml:space="preserve">Server-Side Rendering (SSR): a pagina e gerada no servidor em cada pedido, garantindo dados sempre atualizados;</w:t>
-      </w:r>
-    </w:p>
-    <w:p>
-      <w:pPr>
-        <w:pStyle w:val="ListParagraph"/>
-        <w:numPr>
-          <w:ilvl w:val="0"/>
-          <w:numId w:val="1"/>
-        </w:numPr>
-        <w:spacing w:after="100" w:line="276" w:lineRule="auto"/>
-        <w:jc w:val="both"/>
-      </w:pPr>
-      <w:r>
-        <w:rPr>
-          <w:rFonts w:ascii="Times New Roman" w:cs="Times New Roman" w:eastAsia="Times New Roman" w:hAnsi="Times New Roman"/>
-          <w:sz w:val="24"/>
-          <w:szCs w:val="24"/>
-        </w:rPr>
-        <w:t xml:space="preserve">Static Site Generation (SSG): as paginas sao pre-geradas em tempo de compilacao, oferecendo o maximo desempenho;</w:t>
-      </w:r>
-    </w:p>
-    <w:p>
-      <w:pPr>
-        <w:pStyle w:val="ListParagraph"/>
-        <w:numPr>
-          <w:ilvl w:val="0"/>
-          <w:numId w:val="1"/>
-        </w:numPr>
-        <w:spacing w:after="100" w:line="276" w:lineRule="auto"/>
-        <w:jc w:val="both"/>
-      </w:pPr>
-      <w:r>
-        <w:rPr>
-          <w:rFonts w:ascii="Times New Roman" w:cs="Times New Roman" w:eastAsia="Times New Roman" w:hAnsi="Times New Roman"/>
-          <w:sz w:val="24"/>
-          <w:szCs w:val="24"/>
-        </w:rPr>
-        <w:t xml:space="preserve">Incremental Static Regeneration (ISR): permite atualizar paginas estaticas em segundo plano sem re-compilar toda a aplicacao;</w:t>
-      </w:r>
-    </w:p>
-    <w:p>
-      <w:pPr>
-        <w:pStyle w:val="ListParagraph"/>
-        <w:numPr>
-          <w:ilvl w:val="0"/>
-          <w:numId w:val="1"/>
-        </w:numPr>
-        <w:spacing w:after="100" w:line="276" w:lineRule="auto"/>
-        <w:jc w:val="both"/>
-      </w:pPr>
-      <w:r>
-        <w:rPr>
-          <w:rFonts w:ascii="Times New Roman" w:cs="Times New Roman" w:eastAsia="Times New Roman" w:hAnsi="Times New Roman"/>
-          <w:sz w:val="24"/>
-          <w:szCs w:val="24"/>
-        </w:rPr>
-        <w:t xml:space="preserve">Client-Side Rendering (CSR): renderizacao tradicional no browser, adequada para componentes altamente interativos.</w:t>
+        <w:t xml:space="preserve">One of Next.js's most distinctive characteristics is its ability to combine different rendering strategies within the same application:</w:t>
+      </w:r>
+    </w:p>
+    <w:p>
+      <w:pPr>
+        <w:pStyle w:val="ListParagraph"/>
+        <w:numPr>
+          <w:ilvl w:val="0"/>
+          <w:numId w:val="1"/>
+        </w:numPr>
+        <w:spacing w:after="100" w:line="276" w:lineRule="auto"/>
+        <w:jc w:val="both"/>
+      </w:pPr>
+      <w:r>
+        <w:rPr>
+          <w:rFonts w:ascii="Times New Roman" w:cs="Times New Roman" w:eastAsia="Times New Roman" w:hAnsi="Times New Roman"/>
+          <w:sz w:val="24"/>
+          <w:szCs w:val="24"/>
+        </w:rPr>
+        <w:t xml:space="preserve">Server-Side Rendering (SSR): the page is generated on the server per request, ensuring always up-to-date data;</w:t>
+      </w:r>
+    </w:p>
+    <w:p>
+      <w:pPr>
+        <w:pStyle w:val="ListParagraph"/>
+        <w:numPr>
+          <w:ilvl w:val="0"/>
+          <w:numId w:val="1"/>
+        </w:numPr>
+        <w:spacing w:after="100" w:line="276" w:lineRule="auto"/>
+        <w:jc w:val="both"/>
+      </w:pPr>
+      <w:r>
+        <w:rPr>
+          <w:rFonts w:ascii="Times New Roman" w:cs="Times New Roman" w:eastAsia="Times New Roman" w:hAnsi="Times New Roman"/>
+          <w:sz w:val="24"/>
+          <w:szCs w:val="24"/>
+        </w:rPr>
+        <w:t xml:space="preserve">Static Site Generation (SSG): pages are pre-generated at build time, offering maximum performance;</w:t>
+      </w:r>
+    </w:p>
+    <w:p>
+      <w:pPr>
+        <w:pStyle w:val="ListParagraph"/>
+        <w:numPr>
+          <w:ilvl w:val="0"/>
+          <w:numId w:val="1"/>
+        </w:numPr>
+        <w:spacing w:after="100" w:line="276" w:lineRule="auto"/>
+        <w:jc w:val="both"/>
+      </w:pPr>
+      <w:r>
+        <w:rPr>
+          <w:rFonts w:ascii="Times New Roman" w:cs="Times New Roman" w:eastAsia="Times New Roman" w:hAnsi="Times New Roman"/>
+          <w:sz w:val="24"/>
+          <w:szCs w:val="24"/>
+        </w:rPr>
+        <w:t xml:space="preserve">Incremental Static Regeneration (ISR): allows updating static pages in the background without recompiling the entire application;</w:t>
+      </w:r>
+    </w:p>
+    <w:p>
+      <w:pPr>
+        <w:pStyle w:val="ListParagraph"/>
+        <w:numPr>
+          <w:ilvl w:val="0"/>
+          <w:numId w:val="1"/>
+        </w:numPr>
+        <w:spacing w:after="100" w:line="276" w:lineRule="auto"/>
+        <w:jc w:val="both"/>
+      </w:pPr>
+      <w:r>
+        <w:rPr>
+          <w:rFonts w:ascii="Times New Roman" w:cs="Times New Roman" w:eastAsia="Times New Roman" w:hAnsi="Times New Roman"/>
+          <w:sz w:val="24"/>
+          <w:szCs w:val="24"/>
+        </w:rPr>
+        <w:t xml:space="preserve">Client-Side Rendering (CSR): traditional browser-side rendering, suitable for highly interactive components.</w:t>
       </w:r>
     </w:p>
     <w:p>
@@ -988,7 +988,7 @@
           <w:sz w:val="24"/>
           <w:szCs w:val="24"/>
         </w:rPr>
-        <w:t xml:space="preserve">2.2.2 App Router e React Server Components</w:t>
+        <w:t xml:space="preserve">2.2.2 App Router and React Server Components</w:t>
       </w:r>
     </w:p>
     <w:p>
@@ -1002,7 +1002,7 @@
           <w:sz w:val="24"/>
           <w:szCs w:val="24"/>
         </w:rPr>
-        <w:t xml:space="preserve">A partir da versao 13, o Next.js introduziu o App Router, baseado em React Server Components (RSC). Os RSC permitem que os componentes sejam executados exclusivamente no servidor, reduzindo o bundle JavaScript enviado ao cliente. Esta arquitetura distingue claramente entre componentes de servidor (sem interatividade, sem acesso ao browser) e componentes de cliente (marcados com a diretiva 'use client'), que hidratam no browser e suportam estado e eventos.</w:t>
+        <w:t xml:space="preserve">From version 13 onwards, Next.js introduced the App Router, based on React Server Components (RSC). RSC allow components to run exclusively on the server, reducing the JavaScript bundle sent to the client. This architecture clearly distinguishes between server components (no interactivity, no browser access) and client components (marked with the 'use client' directive), which hydrate in the browser and support state and events.</w:t>
       </w:r>
     </w:p>
     <w:p>
@@ -1020,7 +1020,7 @@
           <w:sz w:val="24"/>
           <w:szCs w:val="24"/>
         </w:rPr>
-        <w:t xml:space="preserve">2.2.3 API Routes e Full-Stack</w:t>
+        <w:t xml:space="preserve">2.2.3 API Routes and Full-Stack</w:t>
       </w:r>
     </w:p>
     <w:p>
@@ -1034,7 +1034,7 @@
           <w:sz w:val="24"/>
           <w:szCs w:val="24"/>
         </w:rPr>
-        <w:t xml:space="preserve">O Next.js inclui suporte nativo a API Routes, permitindo criar endpoints REST diretamente na estrutura da aplicacao, sem necessidade de um servidor separado. Esta funcionalidade posiciona o framework como uma solucao fullstack, integrando frontend e backend num unico projeto.</w:t>
+        <w:t xml:space="preserve">Next.js includes native support for API Routes, enabling REST endpoints to be created directly within the application structure, without the need for a separate server. This feature positions the framework as a full-stack solution, integrating frontend and backend into a single project.</w:t>
       </w:r>
     </w:p>
     <w:p>
@@ -1052,7 +1052,7 @@
           <w:sz w:val="24"/>
           <w:szCs w:val="24"/>
         </w:rPr>
-        <w:t xml:space="preserve">2.2.4 Otimizacoes Integradas</w:t>
+        <w:t xml:space="preserve">2.2.4 Built-in Optimisations</w:t>
       </w:r>
     </w:p>
     <w:p>
@@ -1066,7 +1066,7 @@
           <w:sz w:val="24"/>
           <w:szCs w:val="24"/>
         </w:rPr>
-        <w:t xml:space="preserve">O framework inclui um conjunto de otimizacoes automaticas: otimizacao de imagens (next/image), carregamento de fontes otimizado (next/font), prefetching automatico de rotas, divisao de codigo (code splitting) por rota e suporte a Edge Runtime para funcoes proximas do utilizador.</w:t>
+        <w:t xml:space="preserve">The framework includes a set of automatic optimisations: image optimisation (next/image), optimised font loading (next/font), automatic route prefetching, per-route code splitting, and Edge Runtime support for functions close to the user.</w:t>
       </w:r>
     </w:p>
     <w:p>
@@ -1082,7 +1082,7 @@
           <w:sz w:val="26"/>
           <w:szCs w:val="26"/>
         </w:rPr>
-        <w:t xml:space="preserve">2.3 Ecossistema e Adocao</w:t>
+        <w:t xml:space="preserve">2.3 Ecosystem and Adoption</w:t>
       </w:r>
     </w:p>
     <w:p>
@@ -1096,7 +1096,7 @@
           <w:sz w:val="24"/>
           <w:szCs w:val="24"/>
         </w:rPr>
-        <w:t xml:space="preserve">O Next.js e atualmente um dos frameworks web mais adotados a nivel mundial. De acordo com as sondagens anuais da State of JavaScript (2023), o Next.js e consistentemente classificado como o framework React mais utilizado em ambiente de producao, com uma taxa de satisfacao elevada entre os utilizadores. Empresas como Netflix, TikTok, Twitch, Hulu e GitHub utilizam Next.js nas suas plataformas (Vercel, Inc., 2026).</w:t>
+        <w:t xml:space="preserve">Next.js is currently one of the most widely adopted web frameworks worldwide. According to the annual State of JavaScript surveys (2023), Next.js is consistently ranked as the most used React framework in production environments, with a high satisfaction rate among developers. Companies such as Netflix, TikTok, Twitch, Hulu, and GitHub use Next.js in their platforms (Vercel, Inc., 2026).</w:t>
       </w:r>
     </w:p>
     <w:p>
@@ -1110,7 +1110,7 @@
           <w:sz w:val="24"/>
           <w:szCs w:val="24"/>
         </w:rPr>
-        <w:t xml:space="preserve">O ecossistema do Next.js beneficia da vasta comunidade React, bem como de integracao nativa com a plataforma de deploy da Vercel, que oferece funcionalidades como previews automaticos por pull request, analytics integrado e suporte a Edge Network global.</w:t>
+        <w:t xml:space="preserve">The Next.js ecosystem benefits from the vast React community, as well as native integration with the Vercel deployment platform, which offers features such as automatic PR previews, integrated analytics, and global Edge Network support.</w:t>
       </w:r>
     </w:p>
     <w:p>
@@ -1126,140 +1126,140 @@
           <w:sz w:val="26"/>
           <w:szCs w:val="26"/>
         </w:rPr>
-        <w:t xml:space="preserve">2.4 Vantagens</w:t>
-      </w:r>
-    </w:p>
-    <w:p>
-      <w:pPr>
-        <w:pStyle w:val="ListParagraph"/>
-        <w:numPr>
-          <w:ilvl w:val="0"/>
-          <w:numId w:val="1"/>
-        </w:numPr>
-        <w:spacing w:after="100" w:line="276" w:lineRule="auto"/>
-        <w:jc w:val="both"/>
-      </w:pPr>
-      <w:r>
-        <w:rPr>
-          <w:rFonts w:ascii="Times New Roman" w:cs="Times New Roman" w:eastAsia="Times New Roman" w:hAnsi="Times New Roman"/>
-          <w:sz w:val="24"/>
-          <w:szCs w:val="24"/>
-        </w:rPr>
-        <w:t xml:space="preserve">Renderizacao hibrida: possibilidade de escolher a estrategia de renderizacao mais adequada por rota ou componente;</w:t>
-      </w:r>
-    </w:p>
-    <w:p>
-      <w:pPr>
-        <w:pStyle w:val="ListParagraph"/>
-        <w:numPr>
-          <w:ilvl w:val="0"/>
-          <w:numId w:val="1"/>
-        </w:numPr>
-        <w:spacing w:after="100" w:line="276" w:lineRule="auto"/>
-        <w:jc w:val="both"/>
-      </w:pPr>
-      <w:r>
-        <w:rPr>
-          <w:rFonts w:ascii="Times New Roman" w:cs="Times New Roman" w:eastAsia="Times New Roman" w:hAnsi="Times New Roman"/>
-          <w:sz w:val="24"/>
-          <w:szCs w:val="24"/>
-        </w:rPr>
-        <w:t xml:space="preserve">Developer Experience (DX): configuracao minima, hot-reloading, TypeScript integrado e mensagens de erro detalhadas;</w:t>
-      </w:r>
-    </w:p>
-    <w:p>
-      <w:pPr>
-        <w:pStyle w:val="ListParagraph"/>
-        <w:numPr>
-          <w:ilvl w:val="0"/>
-          <w:numId w:val="1"/>
-        </w:numPr>
-        <w:spacing w:after="100" w:line="276" w:lineRule="auto"/>
-        <w:jc w:val="both"/>
-      </w:pPr>
-      <w:r>
-        <w:rPr>
-          <w:rFonts w:ascii="Times New Roman" w:cs="Times New Roman" w:eastAsia="Times New Roman" w:hAnsi="Times New Roman"/>
-          <w:sz w:val="24"/>
-          <w:szCs w:val="24"/>
-        </w:rPr>
-        <w:t xml:space="preserve">Performance: code splitting automatico, prefetching de rotas, otimizacao de imagens e fontes;</w:t>
-      </w:r>
-    </w:p>
-    <w:p>
-      <w:pPr>
-        <w:pStyle w:val="ListParagraph"/>
-        <w:numPr>
-          <w:ilvl w:val="0"/>
-          <w:numId w:val="1"/>
-        </w:numPr>
-        <w:spacing w:after="100" w:line="276" w:lineRule="auto"/>
-        <w:jc w:val="both"/>
-      </w:pPr>
-      <w:r>
-        <w:rPr>
-          <w:rFonts w:ascii="Times New Roman" w:cs="Times New Roman" w:eastAsia="Times New Roman" w:hAnsi="Times New Roman"/>
-          <w:sz w:val="24"/>
-          <w:szCs w:val="24"/>
-        </w:rPr>
-        <w:t xml:space="preserve">Full-stack numa unica base de codigo: API Routes e Server Actions eliminam a necessidade de um backend separado para casos de uso comuns;</w:t>
-      </w:r>
-    </w:p>
-    <w:p>
-      <w:pPr>
-        <w:pStyle w:val="ListParagraph"/>
-        <w:numPr>
-          <w:ilvl w:val="0"/>
-          <w:numId w:val="1"/>
-        </w:numPr>
-        <w:spacing w:after="100" w:line="276" w:lineRule="auto"/>
-        <w:jc w:val="both"/>
-      </w:pPr>
-      <w:r>
-        <w:rPr>
-          <w:rFonts w:ascii="Times New Roman" w:cs="Times New Roman" w:eastAsia="Times New Roman" w:hAnsi="Times New Roman"/>
-          <w:sz w:val="24"/>
-          <w:szCs w:val="24"/>
-        </w:rPr>
-        <w:t xml:space="preserve">SEO: SSR e SSG garantem que o conteudo e indexavel por motores de busca, ao contrario de aplicacoes SPA puras;</w:t>
-      </w:r>
-    </w:p>
-    <w:p>
-      <w:pPr>
-        <w:pStyle w:val="ListParagraph"/>
-        <w:numPr>
-          <w:ilvl w:val="0"/>
-          <w:numId w:val="1"/>
-        </w:numPr>
-        <w:spacing w:after="100" w:line="276" w:lineRule="auto"/>
-        <w:jc w:val="both"/>
-      </w:pPr>
-      <w:r>
-        <w:rPr>
-          <w:rFonts w:ascii="Times New Roman" w:cs="Times New Roman" w:eastAsia="Times New Roman" w:hAnsi="Times New Roman"/>
-          <w:sz w:val="24"/>
-          <w:szCs w:val="24"/>
-        </w:rPr>
-        <w:t xml:space="preserve">Comunidade e ecossistema: ampla comunidade, documentacao extensa e integracao com o ecossistema React;</w:t>
-      </w:r>
-    </w:p>
-    <w:p>
-      <w:pPr>
-        <w:pStyle w:val="ListParagraph"/>
-        <w:numPr>
-          <w:ilvl w:val="0"/>
-          <w:numId w:val="1"/>
-        </w:numPr>
-        <w:spacing w:after="100" w:line="276" w:lineRule="auto"/>
-        <w:jc w:val="both"/>
-      </w:pPr>
-      <w:r>
-        <w:rPr>
-          <w:rFonts w:ascii="Times New Roman" w:cs="Times New Roman" w:eastAsia="Times New Roman" w:hAnsi="Times New Roman"/>
-          <w:sz w:val="24"/>
-          <w:szCs w:val="24"/>
-        </w:rPr>
-        <w:t xml:space="preserve">Escalabilidade: adequado tanto para projetos pequenos como para aplicacoes de grande escala em producao.</w:t>
+        <w:t xml:space="preserve">2.4 Advantages</w:t>
+      </w:r>
+    </w:p>
+    <w:p>
+      <w:pPr>
+        <w:pStyle w:val="ListParagraph"/>
+        <w:numPr>
+          <w:ilvl w:val="0"/>
+          <w:numId w:val="1"/>
+        </w:numPr>
+        <w:spacing w:after="100" w:line="276" w:lineRule="auto"/>
+        <w:jc w:val="both"/>
+      </w:pPr>
+      <w:r>
+        <w:rPr>
+          <w:rFonts w:ascii="Times New Roman" w:cs="Times New Roman" w:eastAsia="Times New Roman" w:hAnsi="Times New Roman"/>
+          <w:sz w:val="24"/>
+          <w:szCs w:val="24"/>
+        </w:rPr>
+        <w:t xml:space="preserve">Hybrid rendering: ability to choose the most appropriate rendering strategy per route or component;</w:t>
+      </w:r>
+    </w:p>
+    <w:p>
+      <w:pPr>
+        <w:pStyle w:val="ListParagraph"/>
+        <w:numPr>
+          <w:ilvl w:val="0"/>
+          <w:numId w:val="1"/>
+        </w:numPr>
+        <w:spacing w:after="100" w:line="276" w:lineRule="auto"/>
+        <w:jc w:val="both"/>
+      </w:pPr>
+      <w:r>
+        <w:rPr>
+          <w:rFonts w:ascii="Times New Roman" w:cs="Times New Roman" w:eastAsia="Times New Roman" w:hAnsi="Times New Roman"/>
+          <w:sz w:val="24"/>
+          <w:szCs w:val="24"/>
+        </w:rPr>
+        <w:t xml:space="preserve">Developer Experience (DX): minimal configuration, hot-reloading, integrated TypeScript, and detailed error messages;</w:t>
+      </w:r>
+    </w:p>
+    <w:p>
+      <w:pPr>
+        <w:pStyle w:val="ListParagraph"/>
+        <w:numPr>
+          <w:ilvl w:val="0"/>
+          <w:numId w:val="1"/>
+        </w:numPr>
+        <w:spacing w:after="100" w:line="276" w:lineRule="auto"/>
+        <w:jc w:val="both"/>
+      </w:pPr>
+      <w:r>
+        <w:rPr>
+          <w:rFonts w:ascii="Times New Roman" w:cs="Times New Roman" w:eastAsia="Times New Roman" w:hAnsi="Times New Roman"/>
+          <w:sz w:val="24"/>
+          <w:szCs w:val="24"/>
+        </w:rPr>
+        <w:t xml:space="preserve">Performance: automatic code splitting, route prefetching, image and font optimisation;</w:t>
+      </w:r>
+    </w:p>
+    <w:p>
+      <w:pPr>
+        <w:pStyle w:val="ListParagraph"/>
+        <w:numPr>
+          <w:ilvl w:val="0"/>
+          <w:numId w:val="1"/>
+        </w:numPr>
+        <w:spacing w:after="100" w:line="276" w:lineRule="auto"/>
+        <w:jc w:val="both"/>
+      </w:pPr>
+      <w:r>
+        <w:rPr>
+          <w:rFonts w:ascii="Times New Roman" w:cs="Times New Roman" w:eastAsia="Times New Roman" w:hAnsi="Times New Roman"/>
+          <w:sz w:val="24"/>
+          <w:szCs w:val="24"/>
+        </w:rPr>
+        <w:t xml:space="preserve">Full-stack in a single codebase: API Routes and Server Actions eliminate the need for a separate backend for common use cases;</w:t>
+      </w:r>
+    </w:p>
+    <w:p>
+      <w:pPr>
+        <w:pStyle w:val="ListParagraph"/>
+        <w:numPr>
+          <w:ilvl w:val="0"/>
+          <w:numId w:val="1"/>
+        </w:numPr>
+        <w:spacing w:after="100" w:line="276" w:lineRule="auto"/>
+        <w:jc w:val="both"/>
+      </w:pPr>
+      <w:r>
+        <w:rPr>
+          <w:rFonts w:ascii="Times New Roman" w:cs="Times New Roman" w:eastAsia="Times New Roman" w:hAnsi="Times New Roman"/>
+          <w:sz w:val="24"/>
+          <w:szCs w:val="24"/>
+        </w:rPr>
+        <w:t xml:space="preserve">SEO: SSR and SSG ensure content is indexable by search engines, unlike pure SPA applications;</w:t>
+      </w:r>
+    </w:p>
+    <w:p>
+      <w:pPr>
+        <w:pStyle w:val="ListParagraph"/>
+        <w:numPr>
+          <w:ilvl w:val="0"/>
+          <w:numId w:val="1"/>
+        </w:numPr>
+        <w:spacing w:after="100" w:line="276" w:lineRule="auto"/>
+        <w:jc w:val="both"/>
+      </w:pPr>
+      <w:r>
+        <w:rPr>
+          <w:rFonts w:ascii="Times New Roman" w:cs="Times New Roman" w:eastAsia="Times New Roman" w:hAnsi="Times New Roman"/>
+          <w:sz w:val="24"/>
+          <w:szCs w:val="24"/>
+        </w:rPr>
+        <w:t xml:space="preserve">Community and ecosystem: large community, extensive documentation, and integration with the React ecosystem;</w:t>
+      </w:r>
+    </w:p>
+    <w:p>
+      <w:pPr>
+        <w:pStyle w:val="ListParagraph"/>
+        <w:numPr>
+          <w:ilvl w:val="0"/>
+          <w:numId w:val="1"/>
+        </w:numPr>
+        <w:spacing w:after="100" w:line="276" w:lineRule="auto"/>
+        <w:jc w:val="both"/>
+      </w:pPr>
+      <w:r>
+        <w:rPr>
+          <w:rFonts w:ascii="Times New Roman" w:cs="Times New Roman" w:eastAsia="Times New Roman" w:hAnsi="Times New Roman"/>
+          <w:sz w:val="24"/>
+          <w:szCs w:val="24"/>
+        </w:rPr>
+        <w:t xml:space="preserve">Scalability: suitable for both small projects and large-scale production applications.</w:t>
       </w:r>
     </w:p>
     <w:p>
@@ -1275,121 +1275,121 @@
           <w:sz w:val="26"/>
           <w:szCs w:val="26"/>
         </w:rPr>
-        <w:t xml:space="preserve">2.5 Desvantagens</w:t>
-      </w:r>
-    </w:p>
-    <w:p>
-      <w:pPr>
-        <w:pStyle w:val="ListParagraph"/>
-        <w:numPr>
-          <w:ilvl w:val="0"/>
-          <w:numId w:val="1"/>
-        </w:numPr>
-        <w:spacing w:after="100" w:line="276" w:lineRule="auto"/>
-        <w:jc w:val="both"/>
-      </w:pPr>
-      <w:r>
-        <w:rPr>
-          <w:rFonts w:ascii="Times New Roman" w:cs="Times New Roman" w:eastAsia="Times New Roman" w:hAnsi="Times New Roman"/>
-          <w:sz w:val="24"/>
-          <w:szCs w:val="24"/>
-        </w:rPr>
-        <w:t xml:space="preserve">Curva de aprendizagem: o modelo de App Router com React Server Components introduz conceitos novos que exigem compreensao aprofundada;</w:t>
-      </w:r>
-    </w:p>
-    <w:p>
-      <w:pPr>
-        <w:pStyle w:val="ListParagraph"/>
-        <w:numPr>
-          <w:ilvl w:val="0"/>
-          <w:numId w:val="1"/>
-        </w:numPr>
-        <w:spacing w:after="100" w:line="276" w:lineRule="auto"/>
-        <w:jc w:val="both"/>
-      </w:pPr>
-      <w:r>
-        <w:rPr>
-          <w:rFonts w:ascii="Times New Roman" w:cs="Times New Roman" w:eastAsia="Times New Roman" w:hAnsi="Times New Roman"/>
-          <w:sz w:val="24"/>
-          <w:szCs w:val="24"/>
-        </w:rPr>
-        <w:t xml:space="preserve">Complexidade crescente: a separacao entre componentes de servidor e de cliente pode tornar a arquitetura dificil de gerir em projetos grandes;</w:t>
-      </w:r>
-    </w:p>
-    <w:p>
-      <w:pPr>
-        <w:pStyle w:val="ListParagraph"/>
-        <w:numPr>
-          <w:ilvl w:val="0"/>
-          <w:numId w:val="1"/>
-        </w:numPr>
-        <w:spacing w:after="100" w:line="276" w:lineRule="auto"/>
-        <w:jc w:val="both"/>
-      </w:pPr>
-      <w:r>
-        <w:rPr>
-          <w:rFonts w:ascii="Times New Roman" w:cs="Times New Roman" w:eastAsia="Times New Roman" w:hAnsi="Times New Roman"/>
-          <w:sz w:val="24"/>
-          <w:szCs w:val="24"/>
-        </w:rPr>
-        <w:t xml:space="preserve">Dependencia da Vercel: embora seja open-source, o Next.js e desenvolvido pela Vercel, cujos interesses comerciais podem influenciar a direcao do framework;</w:t>
-      </w:r>
-    </w:p>
-    <w:p>
-      <w:pPr>
-        <w:pStyle w:val="ListParagraph"/>
-        <w:numPr>
-          <w:ilvl w:val="0"/>
-          <w:numId w:val="1"/>
-        </w:numPr>
-        <w:spacing w:after="100" w:line="276" w:lineRule="auto"/>
-        <w:jc w:val="both"/>
-      </w:pPr>
-      <w:r>
-        <w:rPr>
-          <w:rFonts w:ascii="Times New Roman" w:cs="Times New Roman" w:eastAsia="Times New Roman" w:hAnsi="Times New Roman"/>
-          <w:sz w:val="24"/>
-          <w:szCs w:val="24"/>
-        </w:rPr>
-        <w:t xml:space="preserve">Cold starts em serverless: funcoes serverless podem sofrer latencia inicial em plataformas que nao mantem instancias aquecidas;</w:t>
-      </w:r>
-    </w:p>
-    <w:p>
-      <w:pPr>
-        <w:pStyle w:val="ListParagraph"/>
-        <w:numPr>
-          <w:ilvl w:val="0"/>
-          <w:numId w:val="1"/>
-        </w:numPr>
-        <w:spacing w:after="100" w:line="276" w:lineRule="auto"/>
-        <w:jc w:val="both"/>
-      </w:pPr>
-      <w:r>
-        <w:rPr>
-          <w:rFonts w:ascii="Times New Roman" w:cs="Times New Roman" w:eastAsia="Times New Roman" w:hAnsi="Times New Roman"/>
-          <w:sz w:val="24"/>
-          <w:szCs w:val="24"/>
-        </w:rPr>
-        <w:t xml:space="preserve">Build times: projetos com muitas paginas estaticas podem ter tempos de compilacao elevados;</w:t>
-      </w:r>
-    </w:p>
-    <w:p>
-      <w:pPr>
-        <w:pStyle w:val="ListParagraph"/>
-        <w:numPr>
-          <w:ilvl w:val="0"/>
-          <w:numId w:val="1"/>
-        </w:numPr>
-        <w:spacing w:after="100" w:line="276" w:lineRule="auto"/>
-        <w:jc w:val="both"/>
-      </w:pPr>
-      <w:r>
-        <w:rPr>
-          <w:rFonts w:ascii="Times New Roman" w:cs="Times New Roman" w:eastAsia="Times New Roman" w:hAnsi="Times New Roman"/>
-          <w:sz w:val="24"/>
-          <w:szCs w:val="24"/>
-        </w:rPr>
-        <w:t xml:space="preserve">Vendor lock-in potencial: algumas funcionalidades avancadas (como Edge Middleware otimizado) funcionam melhor na infraestrutura da Vercel.</w:t>
+        <w:t xml:space="preserve">2.5 Disadvantages</w:t>
+      </w:r>
+    </w:p>
+    <w:p>
+      <w:pPr>
+        <w:pStyle w:val="ListParagraph"/>
+        <w:numPr>
+          <w:ilvl w:val="0"/>
+          <w:numId w:val="1"/>
+        </w:numPr>
+        <w:spacing w:after="100" w:line="276" w:lineRule="auto"/>
+        <w:jc w:val="both"/>
+      </w:pPr>
+      <w:r>
+        <w:rPr>
+          <w:rFonts w:ascii="Times New Roman" w:cs="Times New Roman" w:eastAsia="Times New Roman" w:hAnsi="Times New Roman"/>
+          <w:sz w:val="24"/>
+          <w:szCs w:val="24"/>
+        </w:rPr>
+        <w:t xml:space="preserve">Learning curve: the App Router model with React Server Components introduces new concepts requiring deep understanding;</w:t>
+      </w:r>
+    </w:p>
+    <w:p>
+      <w:pPr>
+        <w:pStyle w:val="ListParagraph"/>
+        <w:numPr>
+          <w:ilvl w:val="0"/>
+          <w:numId w:val="1"/>
+        </w:numPr>
+        <w:spacing w:after="100" w:line="276" w:lineRule="auto"/>
+        <w:jc w:val="both"/>
+      </w:pPr>
+      <w:r>
+        <w:rPr>
+          <w:rFonts w:ascii="Times New Roman" w:cs="Times New Roman" w:eastAsia="Times New Roman" w:hAnsi="Times New Roman"/>
+          <w:sz w:val="24"/>
+          <w:szCs w:val="24"/>
+        </w:rPr>
+        <w:t xml:space="preserve">Growing complexity: the separation between server and client components can make architecture difficult to manage in large projects;</w:t>
+      </w:r>
+    </w:p>
+    <w:p>
+      <w:pPr>
+        <w:pStyle w:val="ListParagraph"/>
+        <w:numPr>
+          <w:ilvl w:val="0"/>
+          <w:numId w:val="1"/>
+        </w:numPr>
+        <w:spacing w:after="100" w:line="276" w:lineRule="auto"/>
+        <w:jc w:val="both"/>
+      </w:pPr>
+      <w:r>
+        <w:rPr>
+          <w:rFonts w:ascii="Times New Roman" w:cs="Times New Roman" w:eastAsia="Times New Roman" w:hAnsi="Times New Roman"/>
+          <w:sz w:val="24"/>
+          <w:szCs w:val="24"/>
+        </w:rPr>
+        <w:t xml:space="preserve">Vercel dependency: although open-source, Next.js is developed by Vercel, whose commercial interests may influence the framework's direction;</w:t>
+      </w:r>
+    </w:p>
+    <w:p>
+      <w:pPr>
+        <w:pStyle w:val="ListParagraph"/>
+        <w:numPr>
+          <w:ilvl w:val="0"/>
+          <w:numId w:val="1"/>
+        </w:numPr>
+        <w:spacing w:after="100" w:line="276" w:lineRule="auto"/>
+        <w:jc w:val="both"/>
+      </w:pPr>
+      <w:r>
+        <w:rPr>
+          <w:rFonts w:ascii="Times New Roman" w:cs="Times New Roman" w:eastAsia="Times New Roman" w:hAnsi="Times New Roman"/>
+          <w:sz w:val="24"/>
+          <w:szCs w:val="24"/>
+        </w:rPr>
+        <w:t xml:space="preserve">Cold starts in serverless: serverless functions may experience initial latency on platforms that do not maintain warm instances;</w:t>
+      </w:r>
+    </w:p>
+    <w:p>
+      <w:pPr>
+        <w:pStyle w:val="ListParagraph"/>
+        <w:numPr>
+          <w:ilvl w:val="0"/>
+          <w:numId w:val="1"/>
+        </w:numPr>
+        <w:spacing w:after="100" w:line="276" w:lineRule="auto"/>
+        <w:jc w:val="both"/>
+      </w:pPr>
+      <w:r>
+        <w:rPr>
+          <w:rFonts w:ascii="Times New Roman" w:cs="Times New Roman" w:eastAsia="Times New Roman" w:hAnsi="Times New Roman"/>
+          <w:sz w:val="24"/>
+          <w:szCs w:val="24"/>
+        </w:rPr>
+        <w:t xml:space="preserve">Build times: projects with many static pages can have high compilation times;</w:t>
+      </w:r>
+    </w:p>
+    <w:p>
+      <w:pPr>
+        <w:pStyle w:val="ListParagraph"/>
+        <w:numPr>
+          <w:ilvl w:val="0"/>
+          <w:numId w:val="1"/>
+        </w:numPr>
+        <w:spacing w:after="100" w:line="276" w:lineRule="auto"/>
+        <w:jc w:val="both"/>
+      </w:pPr>
+      <w:r>
+        <w:rPr>
+          <w:rFonts w:ascii="Times New Roman" w:cs="Times New Roman" w:eastAsia="Times New Roman" w:hAnsi="Times New Roman"/>
+          <w:sz w:val="24"/>
+          <w:szCs w:val="24"/>
+        </w:rPr>
+        <w:t xml:space="preserve">Potential vendor lock-in: some advanced features (such as optimised Edge Middleware) work best on Vercel's infrastructure.</w:t>
       </w:r>
     </w:p>
     <w:p>
@@ -1405,102 +1405,102 @@
           <w:sz w:val="26"/>
           <w:szCs w:val="26"/>
         </w:rPr>
-        <w:t xml:space="preserve">2.6 Principais Areas de Utilizacao</w:t>
-      </w:r>
-    </w:p>
-    <w:p>
-      <w:pPr>
-        <w:pStyle w:val="ListParagraph"/>
-        <w:numPr>
-          <w:ilvl w:val="0"/>
-          <w:numId w:val="1"/>
-        </w:numPr>
-        <w:spacing w:after="100" w:line="276" w:lineRule="auto"/>
-        <w:jc w:val="both"/>
-      </w:pPr>
-      <w:r>
-        <w:rPr>
-          <w:rFonts w:ascii="Times New Roman" w:cs="Times New Roman" w:eastAsia="Times New Roman" w:hAnsi="Times New Roman"/>
-          <w:sz w:val="24"/>
-          <w:szCs w:val="24"/>
-        </w:rPr>
-        <w:t xml:space="preserve">Plataformas de e-commerce (Shopify Hydrogen, Nike.com): beneficiam do SSG e ISR para paginas de produto altamente performativas;</w:t>
-      </w:r>
-    </w:p>
-    <w:p>
-      <w:pPr>
-        <w:pStyle w:val="ListParagraph"/>
-        <w:numPr>
-          <w:ilvl w:val="0"/>
-          <w:numId w:val="1"/>
-        </w:numPr>
-        <w:spacing w:after="100" w:line="276" w:lineRule="auto"/>
-        <w:jc w:val="both"/>
-      </w:pPr>
-      <w:r>
-        <w:rPr>
-          <w:rFonts w:ascii="Times New Roman" w:cs="Times New Roman" w:eastAsia="Times New Roman" w:hAnsi="Times New Roman"/>
-          <w:sz w:val="24"/>
-          <w:szCs w:val="24"/>
-        </w:rPr>
-        <w:t xml:space="preserve">Aplicacoes SaaS e dashboards: o App Router e os Server Components simplificam a construcao de interfaces complexas com dados dinamicos;</w:t>
-      </w:r>
-    </w:p>
-    <w:p>
-      <w:pPr>
-        <w:pStyle w:val="ListParagraph"/>
-        <w:numPr>
-          <w:ilvl w:val="0"/>
-          <w:numId w:val="1"/>
-        </w:numPr>
-        <w:spacing w:after="100" w:line="276" w:lineRule="auto"/>
-        <w:jc w:val="both"/>
-      </w:pPr>
-      <w:r>
-        <w:rPr>
-          <w:rFonts w:ascii="Times New Roman" w:cs="Times New Roman" w:eastAsia="Times New Roman" w:hAnsi="Times New Roman"/>
-          <w:sz w:val="24"/>
-          <w:szCs w:val="24"/>
-        </w:rPr>
-        <w:t xml:space="preserve">Portais de conteudo e media (blogs, jornais online): o SSG gera paginas estaticas com performance maxima;</w:t>
-      </w:r>
-    </w:p>
-    <w:p>
-      <w:pPr>
-        <w:pStyle w:val="ListParagraph"/>
-        <w:numPr>
-          <w:ilvl w:val="0"/>
-          <w:numId w:val="1"/>
-        </w:numPr>
-        <w:spacing w:after="100" w:line="276" w:lineRule="auto"/>
-        <w:jc w:val="both"/>
-      </w:pPr>
-      <w:r>
-        <w:rPr>
-          <w:rFonts w:ascii="Times New Roman" w:cs="Times New Roman" w:eastAsia="Times New Roman" w:hAnsi="Times New Roman"/>
-          <w:sz w:val="24"/>
-          <w:szCs w:val="24"/>
-        </w:rPr>
-        <w:t xml:space="preserve">APIs e aplicacoes fullstack: as API Routes permitem construir backends simples sem infraestrutura adicional;</w:t>
-      </w:r>
-    </w:p>
-    <w:p>
-      <w:pPr>
-        <w:pStyle w:val="ListParagraph"/>
-        <w:numPr>
-          <w:ilvl w:val="0"/>
-          <w:numId w:val="1"/>
-        </w:numPr>
-        <w:spacing w:after="100" w:line="276" w:lineRule="auto"/>
-        <w:jc w:val="both"/>
-      </w:pPr>
-      <w:r>
-        <w:rPr>
-          <w:rFonts w:ascii="Times New Roman" w:cs="Times New Roman" w:eastAsia="Times New Roman" w:hAnsi="Times New Roman"/>
-          <w:sz w:val="24"/>
-          <w:szCs w:val="24"/>
-        </w:rPr>
-        <w:t xml:space="preserve">Aplicacoes financeiras e de dados em tempo real: a flexibilidade de renderizacao e o suporte a atualizacoes incrementais tornam o Next.js adequado para dashboards de dados ao vivo.</w:t>
+        <w:t xml:space="preserve">2.6 Main Areas of Use</w:t>
+      </w:r>
+    </w:p>
+    <w:p>
+      <w:pPr>
+        <w:pStyle w:val="ListParagraph"/>
+        <w:numPr>
+          <w:ilvl w:val="0"/>
+          <w:numId w:val="1"/>
+        </w:numPr>
+        <w:spacing w:after="100" w:line="276" w:lineRule="auto"/>
+        <w:jc w:val="both"/>
+      </w:pPr>
+      <w:r>
+        <w:rPr>
+          <w:rFonts w:ascii="Times New Roman" w:cs="Times New Roman" w:eastAsia="Times New Roman" w:hAnsi="Times New Roman"/>
+          <w:sz w:val="24"/>
+          <w:szCs w:val="24"/>
+        </w:rPr>
+        <w:t xml:space="preserve">E-commerce platforms (Shopify Hydrogen, Nike.com): benefit from SSG and ISR for high-performance product pages;</w:t>
+      </w:r>
+    </w:p>
+    <w:p>
+      <w:pPr>
+        <w:pStyle w:val="ListParagraph"/>
+        <w:numPr>
+          <w:ilvl w:val="0"/>
+          <w:numId w:val="1"/>
+        </w:numPr>
+        <w:spacing w:after="100" w:line="276" w:lineRule="auto"/>
+        <w:jc w:val="both"/>
+      </w:pPr>
+      <w:r>
+        <w:rPr>
+          <w:rFonts w:ascii="Times New Roman" w:cs="Times New Roman" w:eastAsia="Times New Roman" w:hAnsi="Times New Roman"/>
+          <w:sz w:val="24"/>
+          <w:szCs w:val="24"/>
+        </w:rPr>
+        <w:t xml:space="preserve">SaaS applications and dashboards: the App Router and Server Components simplify building complex interfaces with dynamic data;</w:t>
+      </w:r>
+    </w:p>
+    <w:p>
+      <w:pPr>
+        <w:pStyle w:val="ListParagraph"/>
+        <w:numPr>
+          <w:ilvl w:val="0"/>
+          <w:numId w:val="1"/>
+        </w:numPr>
+        <w:spacing w:after="100" w:line="276" w:lineRule="auto"/>
+        <w:jc w:val="both"/>
+      </w:pPr>
+      <w:r>
+        <w:rPr>
+          <w:rFonts w:ascii="Times New Roman" w:cs="Times New Roman" w:eastAsia="Times New Roman" w:hAnsi="Times New Roman"/>
+          <w:sz w:val="24"/>
+          <w:szCs w:val="24"/>
+        </w:rPr>
+        <w:t xml:space="preserve">Content and media portals (blogs, online newspapers): SSG generates static pages with maximum performance;</w:t>
+      </w:r>
+    </w:p>
+    <w:p>
+      <w:pPr>
+        <w:pStyle w:val="ListParagraph"/>
+        <w:numPr>
+          <w:ilvl w:val="0"/>
+          <w:numId w:val="1"/>
+        </w:numPr>
+        <w:spacing w:after="100" w:line="276" w:lineRule="auto"/>
+        <w:jc w:val="both"/>
+      </w:pPr>
+      <w:r>
+        <w:rPr>
+          <w:rFonts w:ascii="Times New Roman" w:cs="Times New Roman" w:eastAsia="Times New Roman" w:hAnsi="Times New Roman"/>
+          <w:sz w:val="24"/>
+          <w:szCs w:val="24"/>
+        </w:rPr>
+        <w:t xml:space="preserve">Full-stack APIs and applications: API Routes allow building simple backends without additional infrastructure;</w:t>
+      </w:r>
+    </w:p>
+    <w:p>
+      <w:pPr>
+        <w:pStyle w:val="ListParagraph"/>
+        <w:numPr>
+          <w:ilvl w:val="0"/>
+          <w:numId w:val="1"/>
+        </w:numPr>
+        <w:spacing w:after="100" w:line="276" w:lineRule="auto"/>
+        <w:jc w:val="both"/>
+      </w:pPr>
+      <w:r>
+        <w:rPr>
+          <w:rFonts w:ascii="Times New Roman" w:cs="Times New Roman" w:eastAsia="Times New Roman" w:hAnsi="Times New Roman"/>
+          <w:sz w:val="24"/>
+          <w:szCs w:val="24"/>
+        </w:rPr>
+        <w:t xml:space="preserve">Financial and real-time data applications: rendering flexibility and support for incremental updates make Next.js suitable for live data dashboards.</w:t>
       </w:r>
     </w:p>
     <w:p>
@@ -1516,7 +1516,7 @@
           <w:sz w:val="26"/>
           <w:szCs w:val="26"/>
         </w:rPr>
-        <w:t xml:space="preserve">2.7 Comparacao com Alternativas</w:t>
+        <w:t xml:space="preserve">2.7 Comparison with Alternatives</w:t>
       </w:r>
     </w:p>
     <w:p>
@@ -1530,7 +1530,7 @@
           <w:sz w:val="24"/>
           <w:szCs w:val="24"/>
         </w:rPr>
-        <w:t xml:space="preserve">A Tabela 1 compara o Next.js com frameworks alternativos no mesmo espaco de mercado:</w:t>
+        <w:t xml:space="preserve">Table 1 compares Next.js with alternative frameworks in the same market space:</w:t>
       </w:r>
     </w:p>
     <w:p>
@@ -1619,7 +1619,7 @@
                 <w:sz w:val="24"/>
                 <w:szCs w:val="24"/>
               </w:rPr>
-              <w:t xml:space="preserve">Renderizacao</w:t>
+              <w:t xml:space="preserve">Rendering</w:t>
             </w:r>
           </w:p>
         </w:tc>
@@ -1655,7 +1655,7 @@
                 <w:sz w:val="24"/>
                 <w:szCs w:val="24"/>
               </w:rPr>
-              <w:t xml:space="preserve">Ponto Forte</w:t>
+              <w:t xml:space="preserve">Strength</w:t>
             </w:r>
           </w:p>
         </w:tc>
@@ -1721,23 +1721,23 @@
                 <w:sz w:val="24"/>
                 <w:szCs w:val="24"/>
               </w:rPr>
-              <w:t xml:space="preserve">Sim (API Routes)</w:t>
-            </w:r>
-          </w:p>
-        </w:tc>
-        <w:tc>
-          <w:p>
-            <w:pPr>
-              <w:spacing w:after="200" w:line="276" w:lineRule="auto"/>
-              <w:jc w:val="both"/>
-            </w:pPr>
-            <w:r>
-              <w:rPr>
-                <w:rFonts w:ascii="Times New Roman" w:cs="Times New Roman" w:eastAsia="Times New Roman" w:hAnsi="Times New Roman"/>
-                <w:sz w:val="24"/>
-                <w:szCs w:val="24"/>
-              </w:rPr>
-              <w:t xml:space="preserve">Flexibilidade e DX</w:t>
+              <w:t xml:space="preserve">Yes (API Routes)</w:t>
+            </w:r>
+          </w:p>
+        </w:tc>
+        <w:tc>
+          <w:p>
+            <w:pPr>
+              <w:spacing w:after="200" w:line="276" w:lineRule="auto"/>
+              <w:jc w:val="both"/>
+            </w:pPr>
+            <w:r>
+              <w:rPr>
+                <w:rFonts w:ascii="Times New Roman" w:cs="Times New Roman" w:eastAsia="Times New Roman" w:hAnsi="Times New Roman"/>
+                <w:sz w:val="24"/>
+                <w:szCs w:val="24"/>
+              </w:rPr>
+              <w:t xml:space="preserve">Flexibility and DX</w:t>
             </w:r>
           </w:p>
         </w:tc>
@@ -1803,23 +1803,23 @@
                 <w:sz w:val="24"/>
                 <w:szCs w:val="24"/>
               </w:rPr>
-              <w:t xml:space="preserve">Sim</w:t>
-            </w:r>
-          </w:p>
-        </w:tc>
-        <w:tc>
-          <w:p>
-            <w:pPr>
-              <w:spacing w:after="200" w:line="276" w:lineRule="auto"/>
-              <w:jc w:val="both"/>
-            </w:pPr>
-            <w:r>
-              <w:rPr>
-                <w:rFonts w:ascii="Times New Roman" w:cs="Times New Roman" w:eastAsia="Times New Roman" w:hAnsi="Times New Roman"/>
-                <w:sz w:val="24"/>
-                <w:szCs w:val="24"/>
-              </w:rPr>
-              <w:t xml:space="preserve">Ecossistema Vue</w:t>
+              <w:t xml:space="preserve">Yes</w:t>
+            </w:r>
+          </w:p>
+        </w:tc>
+        <w:tc>
+          <w:p>
+            <w:pPr>
+              <w:spacing w:after="200" w:line="276" w:lineRule="auto"/>
+              <w:jc w:val="both"/>
+            </w:pPr>
+            <w:r>
+              <w:rPr>
+                <w:rFonts w:ascii="Times New Roman" w:cs="Times New Roman" w:eastAsia="Times New Roman" w:hAnsi="Times New Roman"/>
+                <w:sz w:val="24"/>
+                <w:szCs w:val="24"/>
+              </w:rPr>
+              <w:t xml:space="preserve">Vue ecosystem</w:t>
             </w:r>
           </w:p>
         </w:tc>
@@ -1885,23 +1885,23 @@
                 <w:sz w:val="24"/>
                 <w:szCs w:val="24"/>
               </w:rPr>
-              <w:t xml:space="preserve">Sim</w:t>
-            </w:r>
-          </w:p>
-        </w:tc>
-        <w:tc>
-          <w:p>
-            <w:pPr>
-              <w:spacing w:after="200" w:line="276" w:lineRule="auto"/>
-              <w:jc w:val="both"/>
-            </w:pPr>
-            <w:r>
-              <w:rPr>
-                <w:rFonts w:ascii="Times New Roman" w:cs="Times New Roman" w:eastAsia="Times New Roman" w:hAnsi="Times New Roman"/>
-                <w:sz w:val="24"/>
-                <w:szCs w:val="24"/>
-              </w:rPr>
-              <w:t xml:space="preserve">Performance / bundle reduzido</w:t>
+              <w:t xml:space="preserve">Yes</w:t>
+            </w:r>
+          </w:p>
+        </w:tc>
+        <w:tc>
+          <w:p>
+            <w:pPr>
+              <w:spacing w:after="200" w:line="276" w:lineRule="auto"/>
+              <w:jc w:val="both"/>
+            </w:pPr>
+            <w:r>
+              <w:rPr>
+                <w:rFonts w:ascii="Times New Roman" w:cs="Times New Roman" w:eastAsia="Times New Roman" w:hAnsi="Times New Roman"/>
+                <w:sz w:val="24"/>
+                <w:szCs w:val="24"/>
+              </w:rPr>
+              <w:t xml:space="preserve">Performance / small bundle</w:t>
             </w:r>
           </w:p>
         </w:tc>
@@ -1967,7 +1967,7 @@
                 <w:sz w:val="24"/>
                 <w:szCs w:val="24"/>
               </w:rPr>
-              <w:t xml:space="preserve">Sim</w:t>
+              <w:t xml:space="preserve">Yes</w:t>
             </w:r>
           </w:p>
         </w:tc>
@@ -2049,23 +2049,23 @@
                 <w:sz w:val="24"/>
                 <w:szCs w:val="24"/>
               </w:rPr>
-              <w:t xml:space="preserve">Parcial</w:t>
-            </w:r>
-          </w:p>
-        </w:tc>
-        <w:tc>
-          <w:p>
-            <w:pPr>
-              <w:spacing w:after="200" w:line="276" w:lineRule="auto"/>
-              <w:jc w:val="both"/>
-            </w:pPr>
-            <w:r>
-              <w:rPr>
-                <w:rFonts w:ascii="Times New Roman" w:cs="Times New Roman" w:eastAsia="Times New Roman" w:hAnsi="Times New Roman"/>
-                <w:sz w:val="24"/>
-                <w:szCs w:val="24"/>
-              </w:rPr>
-              <w:t xml:space="preserve">Sites de conteudo estatico</w:t>
+              <w:t xml:space="preserve">Partial</w:t>
+            </w:r>
+          </w:p>
+        </w:tc>
+        <w:tc>
+          <w:p>
+            <w:pPr>
+              <w:spacing w:after="200" w:line="276" w:lineRule="auto"/>
+              <w:jc w:val="both"/>
+            </w:pPr>
+            <w:r>
+              <w:rPr>
+                <w:rFonts w:ascii="Times New Roman" w:cs="Times New Roman" w:eastAsia="Times New Roman" w:hAnsi="Times New Roman"/>
+                <w:sz w:val="24"/>
+                <w:szCs w:val="24"/>
+              </w:rPr>
+              <w:t xml:space="preserve">Static content sites</w:t>
             </w:r>
           </w:p>
         </w:tc>
@@ -2097,7 +2097,7 @@
           <w:sz w:val="20"/>
           <w:szCs w:val="20"/>
         </w:rPr>
-        <w:t xml:space="preserve">Tabela 1 – Comparacao de frameworks: Next.js vs alternativas</w:t>
+        <w:t xml:space="preserve">Table 1 – Framework comparison: Next.js vs alternatives</w:t>
       </w:r>
     </w:p>
     <w:p>
@@ -2131,7 +2131,7 @@
           <w:sz w:val="28"/>
           <w:szCs w:val="28"/>
         </w:rPr>
-        <w:t xml:space="preserve">3. Metodologia de Resolucao do Problema</w:t>
+        <w:t xml:space="preserve">3. Problem-Solving Methodology</w:t>
       </w:r>
     </w:p>
     <w:p>
@@ -2147,7 +2147,7 @@
           <w:sz w:val="26"/>
           <w:szCs w:val="26"/>
         </w:rPr>
-        <w:t xml:space="preserve">3.1 Abordagem de Investigacao</w:t>
+        <w:t xml:space="preserve">3.1 Research Approach</w:t>
       </w:r>
     </w:p>
     <w:p>
@@ -2161,7 +2161,7 @@
           <w:sz w:val="24"/>
           <w:szCs w:val="24"/>
         </w:rPr>
-        <w:t xml:space="preserve">A investigacao sobre o Next.js foi conduzida com base em fontes primarias (documentacao oficial do framework, changelogs de versoes, repositorio GitHub) e secundarias (artigos academicos, publicacoes tecnicas, sondagens da comunidade). Esta analise permitiu estruturar o estado da arte apresentado na Seccao 2 e identificar os casos de uso mais relevantes do framework.</w:t>
+        <w:t xml:space="preserve">The investigation into Next.js was conducted based on primary sources (official framework documentation, version changelogs, GitHub repository) and secondary sources (academic articles, technical publications, community surveys). This analysis enabled the structuring of the state of the art presented in Section 2 and the identification of the most relevant use cases for the framework.</w:t>
       </w:r>
     </w:p>
     <w:p>
@@ -2177,7 +2177,7 @@
           <w:sz w:val="26"/>
           <w:szCs w:val="26"/>
         </w:rPr>
-        <w:t xml:space="preserve">3.2 Selecao da Aplicacao de Demonstracao</w:t>
+        <w:t xml:space="preserve">3.2 Selection of the Demonstration Application</w:t>
       </w:r>
     </w:p>
     <w:p>
@@ -2191,83 +2191,83 @@
           <w:sz w:val="24"/>
           <w:szCs w:val="24"/>
         </w:rPr>
-        <w:t xml:space="preserve">Para demonstrar as capacidades do Next.js em contexto real, foi desenvolvida uma aplicacao denominada Market Dashboard, uma plataforma de visualizacao de dados financeiros em tempo real. Esta escolha foi motivada pela necessidade de exercitar funcionalidades-chave do framework:</w:t>
-      </w:r>
-    </w:p>
-    <w:p>
-      <w:pPr>
-        <w:pStyle w:val="ListParagraph"/>
-        <w:numPr>
-          <w:ilvl w:val="0"/>
-          <w:numId w:val="1"/>
-        </w:numPr>
-        <w:spacing w:after="100" w:line="276" w:lineRule="auto"/>
-        <w:jc w:val="both"/>
-      </w:pPr>
-      <w:r>
-        <w:rPr>
-          <w:rFonts w:ascii="Times New Roman" w:cs="Times New Roman" w:eastAsia="Times New Roman" w:hAnsi="Times New Roman"/>
-          <w:sz w:val="24"/>
-          <w:szCs w:val="24"/>
-        </w:rPr>
-        <w:t xml:space="preserve">API Routes (full-stack): implementacao de endpoints REST para acesso a dados externos;</w:t>
-      </w:r>
-    </w:p>
-    <w:p>
-      <w:pPr>
-        <w:pStyle w:val="ListParagraph"/>
-        <w:numPr>
-          <w:ilvl w:val="0"/>
-          <w:numId w:val="1"/>
-        </w:numPr>
-        <w:spacing w:after="100" w:line="276" w:lineRule="auto"/>
-        <w:jc w:val="both"/>
-      </w:pPr>
-      <w:r>
-        <w:rPr>
-          <w:rFonts w:ascii="Times New Roman" w:cs="Times New Roman" w:eastAsia="Times New Roman" w:hAnsi="Times New Roman"/>
-          <w:sz w:val="24"/>
-          <w:szCs w:val="24"/>
-        </w:rPr>
-        <w:t xml:space="preserve">App Router com componentes de servidor e de cliente: gestao eficiente do rendering hibrido;</w:t>
-      </w:r>
-    </w:p>
-    <w:p>
-      <w:pPr>
-        <w:pStyle w:val="ListParagraph"/>
-        <w:numPr>
-          <w:ilvl w:val="0"/>
-          <w:numId w:val="1"/>
-        </w:numPr>
-        <w:spacing w:after="100" w:line="276" w:lineRule="auto"/>
-        <w:jc w:val="both"/>
-      </w:pPr>
-      <w:r>
-        <w:rPr>
-          <w:rFonts w:ascii="Times New Roman" w:cs="Times New Roman" w:eastAsia="Times New Roman" w:hAnsi="Times New Roman"/>
-          <w:sz w:val="24"/>
-          <w:szCs w:val="24"/>
-        </w:rPr>
-        <w:t xml:space="preserve">ISR e cache de dados: politicas de invalidacao de cache para dados com diferentes frequencias de atualizacao;</w:t>
-      </w:r>
-    </w:p>
-    <w:p>
-      <w:pPr>
-        <w:pStyle w:val="ListParagraph"/>
-        <w:numPr>
-          <w:ilvl w:val="0"/>
-          <w:numId w:val="1"/>
-        </w:numPr>
-        <w:spacing w:after="100" w:line="276" w:lineRule="auto"/>
-        <w:jc w:val="both"/>
-      </w:pPr>
-      <w:r>
-        <w:rPr>
-          <w:rFonts w:ascii="Times New Roman" w:cs="Times New Roman" w:eastAsia="Times New Roman" w:hAnsi="Times New Roman"/>
-          <w:sz w:val="24"/>
-          <w:szCs w:val="24"/>
-        </w:rPr>
-        <w:t xml:space="preserve">Componentes de cliente interativos: graficos, filtros e atualizacoes em tempo real.</w:t>
+        <w:t xml:space="preserve">To demonstrate Next.js capabilities in a real context, an application called Market Dashboard was developed — a real-time financial data visualisation platform. This choice was motivated by the need to exercise key framework features:</w:t>
+      </w:r>
+    </w:p>
+    <w:p>
+      <w:pPr>
+        <w:pStyle w:val="ListParagraph"/>
+        <w:numPr>
+          <w:ilvl w:val="0"/>
+          <w:numId w:val="1"/>
+        </w:numPr>
+        <w:spacing w:after="100" w:line="276" w:lineRule="auto"/>
+        <w:jc w:val="both"/>
+      </w:pPr>
+      <w:r>
+        <w:rPr>
+          <w:rFonts w:ascii="Times New Roman" w:cs="Times New Roman" w:eastAsia="Times New Roman" w:hAnsi="Times New Roman"/>
+          <w:sz w:val="24"/>
+          <w:szCs w:val="24"/>
+        </w:rPr>
+        <w:t xml:space="preserve">API Routes (full-stack): implementation of REST endpoints to access external data;</w:t>
+      </w:r>
+    </w:p>
+    <w:p>
+      <w:pPr>
+        <w:pStyle w:val="ListParagraph"/>
+        <w:numPr>
+          <w:ilvl w:val="0"/>
+          <w:numId w:val="1"/>
+        </w:numPr>
+        <w:spacing w:after="100" w:line="276" w:lineRule="auto"/>
+        <w:jc w:val="both"/>
+      </w:pPr>
+      <w:r>
+        <w:rPr>
+          <w:rFonts w:ascii="Times New Roman" w:cs="Times New Roman" w:eastAsia="Times New Roman" w:hAnsi="Times New Roman"/>
+          <w:sz w:val="24"/>
+          <w:szCs w:val="24"/>
+        </w:rPr>
+        <w:t xml:space="preserve">App Router with server and client components: efficient management of hybrid rendering;</w:t>
+      </w:r>
+    </w:p>
+    <w:p>
+      <w:pPr>
+        <w:pStyle w:val="ListParagraph"/>
+        <w:numPr>
+          <w:ilvl w:val="0"/>
+          <w:numId w:val="1"/>
+        </w:numPr>
+        <w:spacing w:after="100" w:line="276" w:lineRule="auto"/>
+        <w:jc w:val="both"/>
+      </w:pPr>
+      <w:r>
+        <w:rPr>
+          <w:rFonts w:ascii="Times New Roman" w:cs="Times New Roman" w:eastAsia="Times New Roman" w:hAnsi="Times New Roman"/>
+          <w:sz w:val="24"/>
+          <w:szCs w:val="24"/>
+        </w:rPr>
+        <w:t xml:space="preserve">ISR and data caching: cache invalidation policies for data with different update frequencies;</w:t>
+      </w:r>
+    </w:p>
+    <w:p>
+      <w:pPr>
+        <w:pStyle w:val="ListParagraph"/>
+        <w:numPr>
+          <w:ilvl w:val="0"/>
+          <w:numId w:val="1"/>
+        </w:numPr>
+        <w:spacing w:after="100" w:line="276" w:lineRule="auto"/>
+        <w:jc w:val="both"/>
+      </w:pPr>
+      <w:r>
+        <w:rPr>
+          <w:rFonts w:ascii="Times New Roman" w:cs="Times New Roman" w:eastAsia="Times New Roman" w:hAnsi="Times New Roman"/>
+          <w:sz w:val="24"/>
+          <w:szCs w:val="24"/>
+        </w:rPr>
+        <w:t xml:space="preserve">Interactive client components: charts, filters, and real-time updates.</w:t>
       </w:r>
     </w:p>
     <w:p>
@@ -2283,7 +2283,7 @@
           <w:sz w:val="26"/>
           <w:szCs w:val="26"/>
         </w:rPr>
-        <w:t xml:space="preserve">3.3 Processo de Desenvolvimento</w:t>
+        <w:t xml:space="preserve">3.3 Development Process</w:t>
       </w:r>
     </w:p>
     <w:p>
@@ -2297,64 +2297,64 @@
           <w:sz w:val="24"/>
           <w:szCs w:val="24"/>
         </w:rPr>
-        <w:t xml:space="preserve">O desenvolvimento seguiu uma abordagem iterativa dividida em tres fases:</w:t>
-      </w:r>
-    </w:p>
-    <w:p>
-      <w:pPr>
-        <w:pStyle w:val="ListParagraph"/>
-        <w:numPr>
-          <w:ilvl w:val="0"/>
-          <w:numId w:val="1"/>
-        </w:numPr>
-        <w:spacing w:after="100" w:line="276" w:lineRule="auto"/>
-        <w:jc w:val="both"/>
-      </w:pPr>
-      <w:r>
-        <w:rPr>
-          <w:rFonts w:ascii="Times New Roman" w:cs="Times New Roman" w:eastAsia="Times New Roman" w:hAnsi="Times New Roman"/>
-          <w:sz w:val="24"/>
-          <w:szCs w:val="24"/>
-        </w:rPr>
-        <w:t xml:space="preserve">Fase 1 – Dashboard base: pagina de listagem de ativos com precos atualizados via API do Yahoo Finance, com fallback para dados simulados em caso de falha;</w:t>
-      </w:r>
-    </w:p>
-    <w:p>
-      <w:pPr>
-        <w:pStyle w:val="ListParagraph"/>
-        <w:numPr>
-          <w:ilvl w:val="0"/>
-          <w:numId w:val="1"/>
-        </w:numPr>
-        <w:spacing w:after="100" w:line="276" w:lineRule="auto"/>
-        <w:jc w:val="both"/>
-      </w:pPr>
-      <w:r>
-        <w:rPr>
-          <w:rFonts w:ascii="Times New Roman" w:cs="Times New Roman" w:eastAsia="Times New Roman" w:hAnsi="Times New Roman"/>
-          <w:sz w:val="24"/>
-          <w:szCs w:val="24"/>
-        </w:rPr>
-        <w:t xml:space="preserve">Fase 2 – Paginas de detalhe: rotas dinamicas /market/[ticker] com metricas por ativo (abertura, maximo, minimo, volume);</w:t>
-      </w:r>
-    </w:p>
-    <w:p>
-      <w:pPr>
-        <w:pStyle w:val="ListParagraph"/>
-        <w:numPr>
-          <w:ilvl w:val="0"/>
-          <w:numId w:val="1"/>
-        </w:numPr>
-        <w:spacing w:after="100" w:line="276" w:lineRule="auto"/>
-        <w:jc w:val="both"/>
-      </w:pPr>
-      <w:r>
-        <w:rPr>
-          <w:rFonts w:ascii="Times New Roman" w:cs="Times New Roman" w:eastAsia="Times New Roman" w:hAnsi="Times New Roman"/>
-          <w:sz w:val="24"/>
-          <w:szCs w:val="24"/>
-        </w:rPr>
-        <w:t xml:space="preserve">Fase 3 – Visualizacao avancada: grafico de candlestick com selecao de timeframe, scroll infinito para dados historicos, polling a 15 segundos e indicadores tecnicos configurAveis.</w:t>
+        <w:t xml:space="preserve">Development followed an iterative approach divided into three phases:</w:t>
+      </w:r>
+    </w:p>
+    <w:p>
+      <w:pPr>
+        <w:pStyle w:val="ListParagraph"/>
+        <w:numPr>
+          <w:ilvl w:val="0"/>
+          <w:numId w:val="1"/>
+        </w:numPr>
+        <w:spacing w:after="100" w:line="276" w:lineRule="auto"/>
+        <w:jc w:val="both"/>
+      </w:pPr>
+      <w:r>
+        <w:rPr>
+          <w:rFonts w:ascii="Times New Roman" w:cs="Times New Roman" w:eastAsia="Times New Roman" w:hAnsi="Times New Roman"/>
+          <w:sz w:val="24"/>
+          <w:szCs w:val="24"/>
+        </w:rPr>
+        <w:t xml:space="preserve">Phase 1 – Base dashboard: asset listing page with updated prices via Yahoo Finance API, with fallback to simulated data on failure;</w:t>
+      </w:r>
+    </w:p>
+    <w:p>
+      <w:pPr>
+        <w:pStyle w:val="ListParagraph"/>
+        <w:numPr>
+          <w:ilvl w:val="0"/>
+          <w:numId w:val="1"/>
+        </w:numPr>
+        <w:spacing w:after="100" w:line="276" w:lineRule="auto"/>
+        <w:jc w:val="both"/>
+      </w:pPr>
+      <w:r>
+        <w:rPr>
+          <w:rFonts w:ascii="Times New Roman" w:cs="Times New Roman" w:eastAsia="Times New Roman" w:hAnsi="Times New Roman"/>
+          <w:sz w:val="24"/>
+          <w:szCs w:val="24"/>
+        </w:rPr>
+        <w:t xml:space="preserve">Phase 2 – Detail pages: dynamic routes /market/[ticker] with per-asset metrics (open, high, low, volume);</w:t>
+      </w:r>
+    </w:p>
+    <w:p>
+      <w:pPr>
+        <w:pStyle w:val="ListParagraph"/>
+        <w:numPr>
+          <w:ilvl w:val="0"/>
+          <w:numId w:val="1"/>
+        </w:numPr>
+        <w:spacing w:after="100" w:line="276" w:lineRule="auto"/>
+        <w:jc w:val="both"/>
+      </w:pPr>
+      <w:r>
+        <w:rPr>
+          <w:rFonts w:ascii="Times New Roman" w:cs="Times New Roman" w:eastAsia="Times New Roman" w:hAnsi="Times New Roman"/>
+          <w:sz w:val="24"/>
+          <w:szCs w:val="24"/>
+        </w:rPr>
+        <w:t xml:space="preserve">Phase 3 – Advanced visualisation: candlestick chart with timeframe selection, infinite scroll for historical data, 15-second polling and configurable technical indicators.</w:t>
       </w:r>
     </w:p>
     <w:p>
@@ -2375,7 +2375,7 @@
           <w:sz w:val="28"/>
           <w:szCs w:val="28"/>
         </w:rPr>
-        <w:t xml:space="preserve">4. Descricao da Implementacao</w:t>
+        <w:t xml:space="preserve">4. Description of the Implementation</w:t>
       </w:r>
     </w:p>
     <w:p>
@@ -2391,7 +2391,7 @@
           <w:sz w:val="26"/>
           <w:szCs w:val="26"/>
         </w:rPr>
-        <w:t xml:space="preserve">4.1 Tecnologias Utilizadas</w:t>
+        <w:t xml:space="preserve">4.1 Technologies Used</w:t>
       </w:r>
     </w:p>
     <w:p>
@@ -2442,7 +2442,7 @@
                 <w:sz w:val="24"/>
                 <w:szCs w:val="24"/>
               </w:rPr>
-              <w:t xml:space="preserve">Tecnologia</w:t>
+              <w:t xml:space="preserve">Technology</w:t>
             </w:r>
           </w:p>
         </w:tc>
@@ -2460,7 +2460,7 @@
                 <w:sz w:val="24"/>
                 <w:szCs w:val="24"/>
               </w:rPr>
-              <w:t xml:space="preserve">Versao</w:t>
+              <w:t xml:space="preserve">Version</w:t>
             </w:r>
           </w:p>
         </w:tc>
@@ -2478,7 +2478,7 @@
                 <w:sz w:val="24"/>
                 <w:szCs w:val="24"/>
               </w:rPr>
-              <w:t xml:space="preserve">Papel na Aplicacao</w:t>
+              <w:t xml:space="preserve">Role in the Application</w:t>
             </w:r>
           </w:p>
         </w:tc>
@@ -2528,7 +2528,7 @@
                 <w:sz w:val="24"/>
                 <w:szCs w:val="24"/>
               </w:rPr>
-              <w:t xml:space="preserve">Framework principal (App Router, SSR, API Routes)</w:t>
+              <w:t xml:space="preserve">Main framework (App Router, SSR, API Routes)</w:t>
             </w:r>
           </w:p>
         </w:tc>
@@ -2578,7 +2578,7 @@
                 <w:sz w:val="24"/>
                 <w:szCs w:val="24"/>
               </w:rPr>
-              <w:t xml:space="preserve">Biblioteca de UI</w:t>
+              <w:t xml:space="preserve">UI library</w:t>
             </w:r>
           </w:p>
         </w:tc>
@@ -2628,7 +2628,7 @@
                 <w:sz w:val="24"/>
                 <w:szCs w:val="24"/>
               </w:rPr>
-              <w:t xml:space="preserve">Tipagem estatica</w:t>
+              <w:t xml:space="preserve">Static typing</w:t>
             </w:r>
           </w:p>
         </w:tc>
@@ -2678,7 +2678,7 @@
                 <w:sz w:val="24"/>
                 <w:szCs w:val="24"/>
               </w:rPr>
-              <w:t xml:space="preserve">Estilizacao utilitaria</w:t>
+              <w:t xml:space="preserve">Utility-first styling</w:t>
             </w:r>
           </w:p>
         </w:tc>
@@ -2728,7 +2728,7 @@
                 <w:sz w:val="24"/>
                 <w:szCs w:val="24"/>
               </w:rPr>
-              <w:t xml:space="preserve">Graficos financeiros (TradingView)</w:t>
+              <w:t xml:space="preserve">Financial charts (TradingView)</w:t>
             </w:r>
           </w:p>
         </w:tc>
@@ -2762,23 +2762,23 @@
                 <w:sz w:val="24"/>
                 <w:szCs w:val="24"/>
               </w:rPr>
-              <w:t xml:space="preserve">Nao oficial</w:t>
-            </w:r>
-          </w:p>
-        </w:tc>
-        <w:tc>
-          <w:p>
-            <w:pPr>
-              <w:spacing w:after="200" w:line="276" w:lineRule="auto"/>
-              <w:jc w:val="both"/>
-            </w:pPr>
-            <w:r>
-              <w:rPr>
-                <w:rFonts w:ascii="Times New Roman" w:cs="Times New Roman" w:eastAsia="Times New Roman" w:hAnsi="Times New Roman"/>
-                <w:sz w:val="24"/>
-                <w:szCs w:val="24"/>
-              </w:rPr>
-              <w:t xml:space="preserve">Fonte de dados de mercado</w:t>
+              <w:t xml:space="preserve">Unofficial</w:t>
+            </w:r>
+          </w:p>
+        </w:tc>
+        <w:tc>
+          <w:p>
+            <w:pPr>
+              <w:spacing w:after="200" w:line="276" w:lineRule="auto"/>
+              <w:jc w:val="both"/>
+            </w:pPr>
+            <w:r>
+              <w:rPr>
+                <w:rFonts w:ascii="Times New Roman" w:cs="Times New Roman" w:eastAsia="Times New Roman" w:hAnsi="Times New Roman"/>
+                <w:sz w:val="24"/>
+                <w:szCs w:val="24"/>
+              </w:rPr>
+              <w:t xml:space="preserve">Market data source</w:t>
             </w:r>
           </w:p>
         </w:tc>
@@ -2810,7 +2810,7 @@
           <w:sz w:val="20"/>
           <w:szCs w:val="20"/>
         </w:rPr>
-        <w:t xml:space="preserve">Tabela 2 – Tecnologias utilizadas na implementacao</w:t>
+        <w:t xml:space="preserve">Table 2 – Technologies used in the implementation</w:t>
       </w:r>
     </w:p>
     <w:p>
@@ -2839,7 +2839,7 @@
           <w:sz w:val="26"/>
           <w:szCs w:val="26"/>
         </w:rPr>
-        <w:t xml:space="preserve">4.2 Arquitetura da Aplicacao</w:t>
+        <w:t xml:space="preserve">4.2 Application Architecture</w:t>
       </w:r>
     </w:p>
     <w:p>
@@ -2853,7 +2853,7 @@
           <w:sz w:val="24"/>
           <w:szCs w:val="24"/>
         </w:rPr>
-        <w:t xml:space="preserve">A aplicacao explora o App Router do Next.js 16, que distingue componentes de servidor de componentes de cliente. Os componentes de servidor executam no servidor e produzem HTML, sem enviar JavaScript ao browser; os componentes de cliente (marcados com 'use client') hidratam no browser e suportam interatividade.</w:t>
+        <w:t xml:space="preserve">The application makes use of the App Router in Next.js 16, which distinguishes between server components and client components. Server components execute on the server and produce HTML without sending JavaScript to the browser; client components (marked with 'use client') hydrate in the browser and support interactivity.</w:t>
       </w:r>
     </w:p>
     <w:p>
@@ -2867,121 +2867,121 @@
           <w:sz w:val="24"/>
           <w:szCs w:val="24"/>
         </w:rPr>
-        <w:t xml:space="preserve">A estrutura de rotas e a seguinte:</w:t>
-      </w:r>
-    </w:p>
-    <w:p>
-      <w:pPr>
-        <w:pStyle w:val="ListParagraph"/>
-        <w:numPr>
-          <w:ilvl w:val="0"/>
-          <w:numId w:val="1"/>
-        </w:numPr>
-        <w:spacing w:after="100" w:line="276" w:lineRule="auto"/>
-        <w:jc w:val="both"/>
-      </w:pPr>
-      <w:r>
-        <w:rPr>
-          <w:rFonts w:ascii="Times New Roman" w:cs="Times New Roman" w:eastAsia="Times New Roman" w:hAnsi="Times New Roman"/>
-          <w:sz w:val="24"/>
-          <w:szCs w:val="24"/>
-        </w:rPr>
-        <w:t xml:space="preserve">app/market/page.tsx – componente de servidor; lista de ativos;</w:t>
-      </w:r>
-    </w:p>
-    <w:p>
-      <w:pPr>
-        <w:pStyle w:val="ListParagraph"/>
-        <w:numPr>
-          <w:ilvl w:val="0"/>
-          <w:numId w:val="1"/>
-        </w:numPr>
-        <w:spacing w:after="100" w:line="276" w:lineRule="auto"/>
-        <w:jc w:val="both"/>
-      </w:pPr>
-      <w:r>
-        <w:rPr>
-          <w:rFonts w:ascii="Times New Roman" w:cs="Times New Roman" w:eastAsia="Times New Roman" w:hAnsi="Times New Roman"/>
-          <w:sz w:val="24"/>
-          <w:szCs w:val="24"/>
-        </w:rPr>
-        <w:t xml:space="preserve">app/market/[ticker]/page.tsx – componente de servidor; detalhe do ativo;</w:t>
-      </w:r>
-    </w:p>
-    <w:p>
-      <w:pPr>
-        <w:pStyle w:val="ListParagraph"/>
-        <w:numPr>
-          <w:ilvl w:val="0"/>
-          <w:numId w:val="1"/>
-        </w:numPr>
-        <w:spacing w:after="100" w:line="276" w:lineRule="auto"/>
-        <w:jc w:val="both"/>
-      </w:pPr>
-      <w:r>
-        <w:rPr>
-          <w:rFonts w:ascii="Times New Roman" w:cs="Times New Roman" w:eastAsia="Times New Roman" w:hAnsi="Times New Roman"/>
-          <w:sz w:val="24"/>
-          <w:szCs w:val="24"/>
-        </w:rPr>
-        <w:t xml:space="preserve">app/api/stocks/route.ts – API Route; precos atuais (cache ISR de 30 s);</w:t>
-      </w:r>
-    </w:p>
-    <w:p>
-      <w:pPr>
-        <w:pStyle w:val="ListParagraph"/>
-        <w:numPr>
-          <w:ilvl w:val="0"/>
-          <w:numId w:val="1"/>
-        </w:numPr>
-        <w:spacing w:after="100" w:line="276" w:lineRule="auto"/>
-        <w:jc w:val="both"/>
-      </w:pPr>
-      <w:r>
-        <w:rPr>
-          <w:rFonts w:ascii="Times New Roman" w:cs="Times New Roman" w:eastAsia="Times New Roman" w:hAnsi="Times New Roman"/>
-          <w:sz w:val="24"/>
-          <w:szCs w:val="24"/>
-        </w:rPr>
-        <w:t xml:space="preserve">app/api/ohlcv/[ticker]/route.ts – API Route; dados OHLCV historicos;</w:t>
-      </w:r>
-    </w:p>
-    <w:p>
-      <w:pPr>
-        <w:pStyle w:val="ListParagraph"/>
-        <w:numPr>
-          <w:ilvl w:val="0"/>
-          <w:numId w:val="1"/>
-        </w:numPr>
-        <w:spacing w:after="100" w:line="276" w:lineRule="auto"/>
-        <w:jc w:val="both"/>
-      </w:pPr>
-      <w:r>
-        <w:rPr>
-          <w:rFonts w:ascii="Times New Roman" w:cs="Times New Roman" w:eastAsia="Times New Roman" w:hAnsi="Times New Roman"/>
-          <w:sz w:val="24"/>
-          <w:szCs w:val="24"/>
-        </w:rPr>
-        <w:t xml:space="preserve">components/candlestick-chart.tsx – wrapper com next/dynamic ssr:false;</w:t>
-      </w:r>
-    </w:p>
-    <w:p>
-      <w:pPr>
-        <w:pStyle w:val="ListParagraph"/>
-        <w:numPr>
-          <w:ilvl w:val="0"/>
-          <w:numId w:val="1"/>
-        </w:numPr>
-        <w:spacing w:after="100" w:line="276" w:lineRule="auto"/>
-        <w:jc w:val="both"/>
-      </w:pPr>
-      <w:r>
-        <w:rPr>
-          <w:rFonts w:ascii="Times New Roman" w:cs="Times New Roman" w:eastAsia="Times New Roman" w:hAnsi="Times New Roman"/>
-          <w:sz w:val="24"/>
-          <w:szCs w:val="24"/>
-        </w:rPr>
-        <w:t xml:space="preserve">components/candlestick-chart-inner.tsx – componente de cliente; grafico interativo.</w:t>
+        <w:t xml:space="preserve">The route structure is as follows:</w:t>
+      </w:r>
+    </w:p>
+    <w:p>
+      <w:pPr>
+        <w:pStyle w:val="ListParagraph"/>
+        <w:numPr>
+          <w:ilvl w:val="0"/>
+          <w:numId w:val="1"/>
+        </w:numPr>
+        <w:spacing w:after="100" w:line="276" w:lineRule="auto"/>
+        <w:jc w:val="both"/>
+      </w:pPr>
+      <w:r>
+        <w:rPr>
+          <w:rFonts w:ascii="Times New Roman" w:cs="Times New Roman" w:eastAsia="Times New Roman" w:hAnsi="Times New Roman"/>
+          <w:sz w:val="24"/>
+          <w:szCs w:val="24"/>
+        </w:rPr>
+        <w:t xml:space="preserve">app/market/page.tsx – server component; asset listing page;</w:t>
+      </w:r>
+    </w:p>
+    <w:p>
+      <w:pPr>
+        <w:pStyle w:val="ListParagraph"/>
+        <w:numPr>
+          <w:ilvl w:val="0"/>
+          <w:numId w:val="1"/>
+        </w:numPr>
+        <w:spacing w:after="100" w:line="276" w:lineRule="auto"/>
+        <w:jc w:val="both"/>
+      </w:pPr>
+      <w:r>
+        <w:rPr>
+          <w:rFonts w:ascii="Times New Roman" w:cs="Times New Roman" w:eastAsia="Times New Roman" w:hAnsi="Times New Roman"/>
+          <w:sz w:val="24"/>
+          <w:szCs w:val="24"/>
+        </w:rPr>
+        <w:t xml:space="preserve">app/market/[ticker]/page.tsx – server component; asset detail page;</w:t>
+      </w:r>
+    </w:p>
+    <w:p>
+      <w:pPr>
+        <w:pStyle w:val="ListParagraph"/>
+        <w:numPr>
+          <w:ilvl w:val="0"/>
+          <w:numId w:val="1"/>
+        </w:numPr>
+        <w:spacing w:after="100" w:line="276" w:lineRule="auto"/>
+        <w:jc w:val="both"/>
+      </w:pPr>
+      <w:r>
+        <w:rPr>
+          <w:rFonts w:ascii="Times New Roman" w:cs="Times New Roman" w:eastAsia="Times New Roman" w:hAnsi="Times New Roman"/>
+          <w:sz w:val="24"/>
+          <w:szCs w:val="24"/>
+        </w:rPr>
+        <w:t xml:space="preserve">app/api/stocks/route.ts – API Route; current prices (30-second ISR cache);</w:t>
+      </w:r>
+    </w:p>
+    <w:p>
+      <w:pPr>
+        <w:pStyle w:val="ListParagraph"/>
+        <w:numPr>
+          <w:ilvl w:val="0"/>
+          <w:numId w:val="1"/>
+        </w:numPr>
+        <w:spacing w:after="100" w:line="276" w:lineRule="auto"/>
+        <w:jc w:val="both"/>
+      </w:pPr>
+      <w:r>
+        <w:rPr>
+          <w:rFonts w:ascii="Times New Roman" w:cs="Times New Roman" w:eastAsia="Times New Roman" w:hAnsi="Times New Roman"/>
+          <w:sz w:val="24"/>
+          <w:szCs w:val="24"/>
+        </w:rPr>
+        <w:t xml:space="preserve">app/api/ohlcv/[ticker]/route.ts – API Route; historical OHLCV data;</w:t>
+      </w:r>
+    </w:p>
+    <w:p>
+      <w:pPr>
+        <w:pStyle w:val="ListParagraph"/>
+        <w:numPr>
+          <w:ilvl w:val="0"/>
+          <w:numId w:val="1"/>
+        </w:numPr>
+        <w:spacing w:after="100" w:line="276" w:lineRule="auto"/>
+        <w:jc w:val="both"/>
+      </w:pPr>
+      <w:r>
+        <w:rPr>
+          <w:rFonts w:ascii="Times New Roman" w:cs="Times New Roman" w:eastAsia="Times New Roman" w:hAnsi="Times New Roman"/>
+          <w:sz w:val="24"/>
+          <w:szCs w:val="24"/>
+        </w:rPr>
+        <w:t xml:space="preserve">components/candlestick-chart.tsx – wrapper using next/dynamic ssr:false;</w:t>
+      </w:r>
+    </w:p>
+    <w:p>
+      <w:pPr>
+        <w:pStyle w:val="ListParagraph"/>
+        <w:numPr>
+          <w:ilvl w:val="0"/>
+          <w:numId w:val="1"/>
+        </w:numPr>
+        <w:spacing w:after="100" w:line="276" w:lineRule="auto"/>
+        <w:jc w:val="both"/>
+      </w:pPr>
+      <w:r>
+        <w:rPr>
+          <w:rFonts w:ascii="Times New Roman" w:cs="Times New Roman" w:eastAsia="Times New Roman" w:hAnsi="Times New Roman"/>
+          <w:sz w:val="24"/>
+          <w:szCs w:val="24"/>
+        </w:rPr>
+        <w:t xml:space="preserve">components/candlestick-chart-inner.tsx – client component; interactive chart.</w:t>
       </w:r>
     </w:p>
     <w:p>
@@ -2997,7 +2997,7 @@
           <w:sz w:val="26"/>
           <w:szCs w:val="26"/>
         </w:rPr>
-        <w:t xml:space="preserve">4.3 Camada de API</w:t>
+        <w:t xml:space="preserve">4.3 API Layer</w:t>
       </w:r>
     </w:p>
     <w:p>
@@ -3066,7 +3066,7 @@
                 <w:sz w:val="24"/>
                 <w:szCs w:val="24"/>
               </w:rPr>
-              <w:t xml:space="preserve">Parametros</w:t>
+              <w:t xml:space="preserve">Parameters</w:t>
             </w:r>
           </w:p>
         </w:tc>
@@ -3084,7 +3084,7 @@
                 <w:sz w:val="24"/>
                 <w:szCs w:val="24"/>
               </w:rPr>
-              <w:t xml:space="preserve">Descricao</w:t>
+              <w:t xml:space="preserve">Description</w:t>
             </w:r>
           </w:p>
         </w:tc>
@@ -3134,7 +3134,7 @@
                 <w:sz w:val="24"/>
                 <w:szCs w:val="24"/>
               </w:rPr>
-              <w:t xml:space="preserve">Precos atuais dos 6 ativos (ISR 30 s); fallback simulado</w:t>
+              <w:t xml:space="preserve">Current prices for 6 assets (30-second ISR); simulated fallback</w:t>
             </w:r>
           </w:p>
         </w:tc>
@@ -3184,7 +3184,7 @@
                 <w:sz w:val="24"/>
                 <w:szCs w:val="24"/>
               </w:rPr>
-              <w:t xml:space="preserve">~400 velas OHLCV do Yahoo Finance; paginacao por 'before'</w:t>
+              <w:t xml:space="preserve">~400 OHLCV candles from Yahoo Finance; pagination via 'before'</w:t>
             </w:r>
           </w:p>
         </w:tc>
@@ -3216,7 +3216,7 @@
           <w:sz w:val="20"/>
           <w:szCs w:val="20"/>
         </w:rPr>
-        <w:t xml:space="preserve">Tabela 3 – Endpoints da API interna</w:t>
+        <w:t xml:space="preserve">Table 3 – Internal API endpoints</w:t>
       </w:r>
     </w:p>
     <w:p>
@@ -3245,7 +3245,7 @@
           <w:sz w:val="26"/>
           <w:szCs w:val="26"/>
         </w:rPr>
-        <w:t xml:space="preserve">4.4 Grafico de Candlestick e Indicadores</w:t>
+        <w:t xml:space="preserve">4.4 Candlestick Chart and Indicators</w:t>
       </w:r>
     </w:p>
     <w:p>
@@ -3259,83 +3259,83 @@
           <w:sz w:val="24"/>
           <w:szCs w:val="24"/>
         </w:rPr>
-        <w:t xml:space="preserve">O componente CandlestickChartInner utiliza a biblioteca lightweight-charts v5 da TradingView e implementa quatro comportamentos:</w:t>
-      </w:r>
-    </w:p>
-    <w:p>
-      <w:pPr>
-        <w:pStyle w:val="ListParagraph"/>
-        <w:numPr>
-          <w:ilvl w:val="0"/>
-          <w:numId w:val="1"/>
-        </w:numPr>
-        <w:spacing w:after="100" w:line="276" w:lineRule="auto"/>
-        <w:jc w:val="both"/>
-      </w:pPr>
-      <w:r>
-        <w:rPr>
-          <w:rFonts w:ascii="Times New Roman" w:cs="Times New Roman" w:eastAsia="Times New Roman" w:hAnsi="Times New Roman"/>
-          <w:sz w:val="24"/>
-          <w:szCs w:val="24"/>
-        </w:rPr>
-        <w:t xml:space="preserve">Carregamento inicial: ~400 velas por timeframe (1m, 5m, 15m, 1H, 1D, 1W);</w:t>
-      </w:r>
-    </w:p>
-    <w:p>
-      <w:pPr>
-        <w:pStyle w:val="ListParagraph"/>
-        <w:numPr>
-          <w:ilvl w:val="0"/>
-          <w:numId w:val="1"/>
-        </w:numPr>
-        <w:spacing w:after="100" w:line="276" w:lineRule="auto"/>
-        <w:jc w:val="both"/>
-      </w:pPr>
-      <w:r>
-        <w:rPr>
-          <w:rFonts w:ascii="Times New Roman" w:cs="Times New Roman" w:eastAsia="Times New Roman" w:hAnsi="Times New Roman"/>
-          <w:sz w:val="24"/>
-          <w:szCs w:val="24"/>
-        </w:rPr>
-        <w:t xml:space="preserve">Scroll infinito: detetado via subscribeVisibleLogicalRangeChange; carrega dados mais antigos ao atingir a borda esquerda;</w:t>
-      </w:r>
-    </w:p>
-    <w:p>
-      <w:pPr>
-        <w:pStyle w:val="ListParagraph"/>
-        <w:numPr>
-          <w:ilvl w:val="0"/>
-          <w:numId w:val="1"/>
-        </w:numPr>
-        <w:spacing w:after="100" w:line="276" w:lineRule="auto"/>
-        <w:jc w:val="both"/>
-      </w:pPr>
-      <w:r>
-        <w:rPr>
-          <w:rFonts w:ascii="Times New Roman" w:cs="Times New Roman" w:eastAsia="Times New Roman" w:hAnsi="Times New Roman"/>
-          <w:sz w:val="24"/>
-          <w:szCs w:val="24"/>
-        </w:rPr>
-        <w:t xml:space="preserve">Polling a 15 segundos: atualiza a vela em curso e apende novas velas; guardado por pollInFlightRef para evitar concorrencia;</w:t>
-      </w:r>
-    </w:p>
-    <w:p>
-      <w:pPr>
-        <w:pStyle w:val="ListParagraph"/>
-        <w:numPr>
-          <w:ilvl w:val="0"/>
-          <w:numId w:val="1"/>
-        </w:numPr>
-        <w:spacing w:after="100" w:line="276" w:lineRule="auto"/>
-        <w:jc w:val="both"/>
-      </w:pPr>
-      <w:r>
-        <w:rPr>
-          <w:rFonts w:ascii="Times New Roman" w:cs="Times New Roman" w:eastAsia="Times New Roman" w:hAnsi="Times New Roman"/>
-          <w:sz w:val="24"/>
-          <w:szCs w:val="24"/>
-        </w:rPr>
-        <w:t xml:space="preserve">Indicadores tecnicos: MA 20, MA 50 e Bandas de Bollinger (20 periodos, sigma=2), calculados no cliente e desenhados como series de linha sobrepostas.</w:t>
+        <w:t xml:space="preserve">The CandlestickChartInner component uses TradingView's lightweight-charts v5 library and implements four behaviours:</w:t>
+      </w:r>
+    </w:p>
+    <w:p>
+      <w:pPr>
+        <w:pStyle w:val="ListParagraph"/>
+        <w:numPr>
+          <w:ilvl w:val="0"/>
+          <w:numId w:val="1"/>
+        </w:numPr>
+        <w:spacing w:after="100" w:line="276" w:lineRule="auto"/>
+        <w:jc w:val="both"/>
+      </w:pPr>
+      <w:r>
+        <w:rPr>
+          <w:rFonts w:ascii="Times New Roman" w:cs="Times New Roman" w:eastAsia="Times New Roman" w:hAnsi="Times New Roman"/>
+          <w:sz w:val="24"/>
+          <w:szCs w:val="24"/>
+        </w:rPr>
+        <w:t xml:space="preserve">Initial loading: ~400 candles per timeframe (1m, 5m, 15m, 1H, 1D, 1W);</w:t>
+      </w:r>
+    </w:p>
+    <w:p>
+      <w:pPr>
+        <w:pStyle w:val="ListParagraph"/>
+        <w:numPr>
+          <w:ilvl w:val="0"/>
+          <w:numId w:val="1"/>
+        </w:numPr>
+        <w:spacing w:after="100" w:line="276" w:lineRule="auto"/>
+        <w:jc w:val="both"/>
+      </w:pPr>
+      <w:r>
+        <w:rPr>
+          <w:rFonts w:ascii="Times New Roman" w:cs="Times New Roman" w:eastAsia="Times New Roman" w:hAnsi="Times New Roman"/>
+          <w:sz w:val="24"/>
+          <w:szCs w:val="24"/>
+        </w:rPr>
+        <w:t xml:space="preserve">Infinite scroll: detected via subscribeVisibleLogicalRangeChange; loads older data when reaching the left edge;</w:t>
+      </w:r>
+    </w:p>
+    <w:p>
+      <w:pPr>
+        <w:pStyle w:val="ListParagraph"/>
+        <w:numPr>
+          <w:ilvl w:val="0"/>
+          <w:numId w:val="1"/>
+        </w:numPr>
+        <w:spacing w:after="100" w:line="276" w:lineRule="auto"/>
+        <w:jc w:val="both"/>
+      </w:pPr>
+      <w:r>
+        <w:rPr>
+          <w:rFonts w:ascii="Times New Roman" w:cs="Times New Roman" w:eastAsia="Times New Roman" w:hAnsi="Times New Roman"/>
+          <w:sz w:val="24"/>
+          <w:szCs w:val="24"/>
+        </w:rPr>
+        <w:t xml:space="preserve">15-second polling: updates the current candle and appends new candles; guarded by pollInFlightRef to prevent concurrency;</w:t>
+      </w:r>
+    </w:p>
+    <w:p>
+      <w:pPr>
+        <w:pStyle w:val="ListParagraph"/>
+        <w:numPr>
+          <w:ilvl w:val="0"/>
+          <w:numId w:val="1"/>
+        </w:numPr>
+        <w:spacing w:after="100" w:line="276" w:lineRule="auto"/>
+        <w:jc w:val="both"/>
+      </w:pPr>
+      <w:r>
+        <w:rPr>
+          <w:rFonts w:ascii="Times New Roman" w:cs="Times New Roman" w:eastAsia="Times New Roman" w:hAnsi="Times New Roman"/>
+          <w:sz w:val="24"/>
+          <w:szCs w:val="24"/>
+        </w:rPr>
+        <w:t xml:space="preserve">Technical indicators: MA 20, MA 50, and Bollinger Bands (20 periods, sigma=2), calculated on the client and drawn as overlaid line series.</w:t>
       </w:r>
     </w:p>
     <w:p>
@@ -3351,102 +3351,102 @@
           <w:sz w:val="26"/>
           <w:szCs w:val="26"/>
         </w:rPr>
-        <w:t xml:space="preserve">4.5 Funcionalidades de Destaque do Next.js Utilizadas</w:t>
-      </w:r>
-    </w:p>
-    <w:p>
-      <w:pPr>
-        <w:pStyle w:val="ListParagraph"/>
-        <w:numPr>
-          <w:ilvl w:val="0"/>
-          <w:numId w:val="1"/>
-        </w:numPr>
-        <w:spacing w:after="100" w:line="276" w:lineRule="auto"/>
-        <w:jc w:val="both"/>
-      </w:pPr>
-      <w:r>
-        <w:rPr>
-          <w:rFonts w:ascii="Times New Roman" w:cs="Times New Roman" w:eastAsia="Times New Roman" w:hAnsi="Times New Roman"/>
-          <w:sz w:val="24"/>
-          <w:szCs w:val="24"/>
-        </w:rPr>
-        <w:t xml:space="preserve">App Router com Server e Client Components: separacao clara de responsabilidades e otimizacao do bundle;</w:t>
-      </w:r>
-    </w:p>
-    <w:p>
-      <w:pPr>
-        <w:pStyle w:val="ListParagraph"/>
-        <w:numPr>
-          <w:ilvl w:val="0"/>
-          <w:numId w:val="1"/>
-        </w:numPr>
-        <w:spacing w:after="100" w:line="276" w:lineRule="auto"/>
-        <w:jc w:val="both"/>
-      </w:pPr>
-      <w:r>
-        <w:rPr>
-          <w:rFonts w:ascii="Times New Roman" w:cs="Times New Roman" w:eastAsia="Times New Roman" w:hAnsi="Times New Roman"/>
-          <w:sz w:val="24"/>
-          <w:szCs w:val="24"/>
-        </w:rPr>
-        <w:t xml:space="preserve">API Routes como proxy: evita exposicao de chamadas externas ao cliente e centraliza tratamento de erros;</w:t>
-      </w:r>
-    </w:p>
-    <w:p>
-      <w:pPr>
-        <w:pStyle w:val="ListParagraph"/>
-        <w:numPr>
-          <w:ilvl w:val="0"/>
-          <w:numId w:val="1"/>
-        </w:numPr>
-        <w:spacing w:after="100" w:line="276" w:lineRule="auto"/>
-        <w:jc w:val="both"/>
-      </w:pPr>
-      <w:r>
-        <w:rPr>
-          <w:rFonts w:ascii="Times New Roman" w:cs="Times New Roman" w:eastAsia="Times New Roman" w:hAnsi="Times New Roman"/>
-          <w:sz w:val="24"/>
-          <w:szCs w:val="24"/>
-        </w:rPr>
-        <w:t xml:space="preserve">ISR (revalidate: 30): cache das respostas de preco com invalidacao automatica a cada 30 segundos;</w:t>
-      </w:r>
-    </w:p>
-    <w:p>
-      <w:pPr>
-        <w:pStyle w:val="ListParagraph"/>
-        <w:numPr>
-          <w:ilvl w:val="0"/>
-          <w:numId w:val="1"/>
-        </w:numPr>
-        <w:spacing w:after="100" w:line="276" w:lineRule="auto"/>
-        <w:jc w:val="both"/>
-      </w:pPr>
-      <w:r>
-        <w:rPr>
-          <w:rFonts w:ascii="Times New Roman" w:cs="Times New Roman" w:eastAsia="Times New Roman" w:hAnsi="Times New Roman"/>
-          <w:sz w:val="24"/>
-          <w:szCs w:val="24"/>
-        </w:rPr>
-        <w:t xml:space="preserve">next/dynamic com ssr: false: importacao dinamica para bibliotecas que acedem ao DOM (lightweight-charts);</w:t>
-      </w:r>
-    </w:p>
-    <w:p>
-      <w:pPr>
-        <w:pStyle w:val="ListParagraph"/>
-        <w:numPr>
-          <w:ilvl w:val="0"/>
-          <w:numId w:val="1"/>
-        </w:numPr>
-        <w:spacing w:after="100" w:line="276" w:lineRule="auto"/>
-        <w:jc w:val="both"/>
-      </w:pPr>
-      <w:r>
-        <w:rPr>
-          <w:rFonts w:ascii="Times New Roman" w:cs="Times New Roman" w:eastAsia="Times New Roman" w:hAnsi="Times New Roman"/>
-          <w:sz w:val="24"/>
-          <w:szCs w:val="24"/>
-        </w:rPr>
-        <w:t xml:space="preserve">generateMetadata: metadados dinamicos por pagina para SEO.</w:t>
+        <w:t xml:space="preserve">4.5 Highlighted Next.js Features Used</w:t>
+      </w:r>
+    </w:p>
+    <w:p>
+      <w:pPr>
+        <w:pStyle w:val="ListParagraph"/>
+        <w:numPr>
+          <w:ilvl w:val="0"/>
+          <w:numId w:val="1"/>
+        </w:numPr>
+        <w:spacing w:after="100" w:line="276" w:lineRule="auto"/>
+        <w:jc w:val="both"/>
+      </w:pPr>
+      <w:r>
+        <w:rPr>
+          <w:rFonts w:ascii="Times New Roman" w:cs="Times New Roman" w:eastAsia="Times New Roman" w:hAnsi="Times New Roman"/>
+          <w:sz w:val="24"/>
+          <w:szCs w:val="24"/>
+        </w:rPr>
+        <w:t xml:space="preserve">App Router with Server and Client Components: clear separation of responsibilities and bundle optimisation;</w:t>
+      </w:r>
+    </w:p>
+    <w:p>
+      <w:pPr>
+        <w:pStyle w:val="ListParagraph"/>
+        <w:numPr>
+          <w:ilvl w:val="0"/>
+          <w:numId w:val="1"/>
+        </w:numPr>
+        <w:spacing w:after="100" w:line="276" w:lineRule="auto"/>
+        <w:jc w:val="both"/>
+      </w:pPr>
+      <w:r>
+        <w:rPr>
+          <w:rFonts w:ascii="Times New Roman" w:cs="Times New Roman" w:eastAsia="Times New Roman" w:hAnsi="Times New Roman"/>
+          <w:sz w:val="24"/>
+          <w:szCs w:val="24"/>
+        </w:rPr>
+        <w:t xml:space="preserve">API Routes as proxy: avoids exposing external calls to the client and centralises error handling;</w:t>
+      </w:r>
+    </w:p>
+    <w:p>
+      <w:pPr>
+        <w:pStyle w:val="ListParagraph"/>
+        <w:numPr>
+          <w:ilvl w:val="0"/>
+          <w:numId w:val="1"/>
+        </w:numPr>
+        <w:spacing w:after="100" w:line="276" w:lineRule="auto"/>
+        <w:jc w:val="both"/>
+      </w:pPr>
+      <w:r>
+        <w:rPr>
+          <w:rFonts w:ascii="Times New Roman" w:cs="Times New Roman" w:eastAsia="Times New Roman" w:hAnsi="Times New Roman"/>
+          <w:sz w:val="24"/>
+          <w:szCs w:val="24"/>
+        </w:rPr>
+        <w:t xml:space="preserve">ISR (revalidate: 30): price response caching with automatic invalidation every 30 seconds;</w:t>
+      </w:r>
+    </w:p>
+    <w:p>
+      <w:pPr>
+        <w:pStyle w:val="ListParagraph"/>
+        <w:numPr>
+          <w:ilvl w:val="0"/>
+          <w:numId w:val="1"/>
+        </w:numPr>
+        <w:spacing w:after="100" w:line="276" w:lineRule="auto"/>
+        <w:jc w:val="both"/>
+      </w:pPr>
+      <w:r>
+        <w:rPr>
+          <w:rFonts w:ascii="Times New Roman" w:cs="Times New Roman" w:eastAsia="Times New Roman" w:hAnsi="Times New Roman"/>
+          <w:sz w:val="24"/>
+          <w:szCs w:val="24"/>
+        </w:rPr>
+        <w:t xml:space="preserve">next/dynamic with ssr: false: dynamic import for DOM-accessing libraries (lightweight-charts);</w:t>
+      </w:r>
+    </w:p>
+    <w:p>
+      <w:pPr>
+        <w:pStyle w:val="ListParagraph"/>
+        <w:numPr>
+          <w:ilvl w:val="0"/>
+          <w:numId w:val="1"/>
+        </w:numPr>
+        <w:spacing w:after="100" w:line="276" w:lineRule="auto"/>
+        <w:jc w:val="both"/>
+      </w:pPr>
+      <w:r>
+        <w:rPr>
+          <w:rFonts w:ascii="Times New Roman" w:cs="Times New Roman" w:eastAsia="Times New Roman" w:hAnsi="Times New Roman"/>
+          <w:sz w:val="24"/>
+          <w:szCs w:val="24"/>
+        </w:rPr>
+        <w:t xml:space="preserve">generateMetadata: dynamic per-page metadata for SEO.</w:t>
       </w:r>
     </w:p>
     <w:p>
@@ -3467,7 +3467,7 @@
           <w:sz w:val="28"/>
           <w:szCs w:val="28"/>
         </w:rPr>
-        <w:t xml:space="preserve">5. Conclusoes</w:t>
+        <w:t xml:space="preserve">5. Conclusions</w:t>
       </w:r>
     </w:p>
     <w:p>
@@ -3483,83 +3483,83 @@
           <w:sz w:val="26"/>
           <w:szCs w:val="26"/>
         </w:rPr>
-        <w:t xml:space="preserve">5.1 Dificuldades Encontradas</w:t>
-      </w:r>
-    </w:p>
-    <w:p>
-      <w:pPr>
-        <w:pStyle w:val="ListParagraph"/>
-        <w:numPr>
-          <w:ilvl w:val="0"/>
-          <w:numId w:val="1"/>
-        </w:numPr>
-        <w:spacing w:after="100" w:line="276" w:lineRule="auto"/>
-        <w:jc w:val="both"/>
-      </w:pPr>
-      <w:r>
-        <w:rPr>
-          <w:rFonts w:ascii="Times New Roman" w:cs="Times New Roman" w:eastAsia="Times New Roman" w:hAnsi="Times New Roman"/>
-          <w:sz w:val="24"/>
-          <w:szCs w:val="24"/>
-        </w:rPr>
-        <w:t xml:space="preserve">API do Yahoo Finance: API nao oficial e nao documentada, com campos nulos em series OHLCV e risco de indisponibilidade; resolvido com fallback de dados simulados;</w:t>
-      </w:r>
-    </w:p>
-    <w:p>
-      <w:pPr>
-        <w:pStyle w:val="ListParagraph"/>
-        <w:numPr>
-          <w:ilvl w:val="0"/>
-          <w:numId w:val="1"/>
-        </w:numPr>
-        <w:spacing w:after="100" w:line="276" w:lineRule="auto"/>
-        <w:jc w:val="both"/>
-      </w:pPr>
-      <w:r>
-        <w:rPr>
-          <w:rFonts w:ascii="Times New Roman" w:cs="Times New Roman" w:eastAsia="Times New Roman" w:hAnsi="Times New Roman"/>
-          <w:sz w:val="24"/>
-          <w:szCs w:val="24"/>
-        </w:rPr>
-        <w:t xml:space="preserve">Componentes SSR vs. cliente: lightweight-charts acede ao DOM na importacao, causando erros de hidratacao; resolvido com next/dynamic e ssr: false;</w:t>
-      </w:r>
-    </w:p>
-    <w:p>
-      <w:pPr>
-        <w:pStyle w:val="ListParagraph"/>
-        <w:numPr>
-          <w:ilvl w:val="0"/>
-          <w:numId w:val="1"/>
-        </w:numPr>
-        <w:spacing w:after="100" w:line="276" w:lineRule="auto"/>
-        <w:jc w:val="both"/>
-      </w:pPr>
-      <w:r>
-        <w:rPr>
-          <w:rFonts w:ascii="Times New Roman" w:cs="Times New Roman" w:eastAsia="Times New Roman" w:hAnsi="Times New Roman"/>
-          <w:sz w:val="24"/>
-          <w:szCs w:val="24"/>
-        </w:rPr>
-        <w:t xml:space="preserve">Migracao para lightweight-charts v5: API alterada (addCandlestickSeries removido, substituido por addSeries com definicao de serie como argumento); identificado por analise do codigo-fonte;</w:t>
-      </w:r>
-    </w:p>
-    <w:p>
-      <w:pPr>
-        <w:pStyle w:val="ListParagraph"/>
-        <w:numPr>
-          <w:ilvl w:val="0"/>
-          <w:numId w:val="1"/>
-        </w:numPr>
-        <w:spacing w:after="100" w:line="276" w:lineRule="auto"/>
-        <w:jc w:val="both"/>
-      </w:pPr>
-      <w:r>
-        <w:rPr>
-          <w:rFonts w:ascii="Times New Roman" w:cs="Times New Roman" w:eastAsia="Times New Roman" w:hAnsi="Times New Roman"/>
-          <w:sz w:val="24"/>
-          <w:szCs w:val="24"/>
-        </w:rPr>
-        <w:t xml:space="preserve">Gestao de estado assincrono: coexistencia de polling, paginacao por scroll e troca de timeframe exigiu uso de refs mutaveis (useRef) e guarda pollInFlightRef para evitar condicoes de corrida.</w:t>
+        <w:t xml:space="preserve">5.1 Difficulties Encountered</w:t>
+      </w:r>
+    </w:p>
+    <w:p>
+      <w:pPr>
+        <w:pStyle w:val="ListParagraph"/>
+        <w:numPr>
+          <w:ilvl w:val="0"/>
+          <w:numId w:val="1"/>
+        </w:numPr>
+        <w:spacing w:after="100" w:line="276" w:lineRule="auto"/>
+        <w:jc w:val="both"/>
+      </w:pPr>
+      <w:r>
+        <w:rPr>
+          <w:rFonts w:ascii="Times New Roman" w:cs="Times New Roman" w:eastAsia="Times New Roman" w:hAnsi="Times New Roman"/>
+          <w:sz w:val="24"/>
+          <w:szCs w:val="24"/>
+        </w:rPr>
+        <w:t xml:space="preserve">Yahoo Finance API: unofficial and undocumented API, with null fields in OHLCV series and risk of unavailability; resolved with a simulated data fallback;</w:t>
+      </w:r>
+    </w:p>
+    <w:p>
+      <w:pPr>
+        <w:pStyle w:val="ListParagraph"/>
+        <w:numPr>
+          <w:ilvl w:val="0"/>
+          <w:numId w:val="1"/>
+        </w:numPr>
+        <w:spacing w:after="100" w:line="276" w:lineRule="auto"/>
+        <w:jc w:val="both"/>
+      </w:pPr>
+      <w:r>
+        <w:rPr>
+          <w:rFonts w:ascii="Times New Roman" w:cs="Times New Roman" w:eastAsia="Times New Roman" w:hAnsi="Times New Roman"/>
+          <w:sz w:val="24"/>
+          <w:szCs w:val="24"/>
+        </w:rPr>
+        <w:t xml:space="preserve">SSR vs client components: lightweight-charts accesses the DOM on import, causing hydration errors; resolved with next/dynamic and ssr: false;</w:t>
+      </w:r>
+    </w:p>
+    <w:p>
+      <w:pPr>
+        <w:pStyle w:val="ListParagraph"/>
+        <w:numPr>
+          <w:ilvl w:val="0"/>
+          <w:numId w:val="1"/>
+        </w:numPr>
+        <w:spacing w:after="100" w:line="276" w:lineRule="auto"/>
+        <w:jc w:val="both"/>
+      </w:pPr>
+      <w:r>
+        <w:rPr>
+          <w:rFonts w:ascii="Times New Roman" w:cs="Times New Roman" w:eastAsia="Times New Roman" w:hAnsi="Times New Roman"/>
+          <w:sz w:val="24"/>
+          <w:szCs w:val="24"/>
+        </w:rPr>
+        <w:t xml:space="preserve">Migration to lightweight-charts v5: API changed (addCandlestickSeries removed, replaced by addSeries with series definition as argument); identified through source code analysis;</w:t>
+      </w:r>
+    </w:p>
+    <w:p>
+      <w:pPr>
+        <w:pStyle w:val="ListParagraph"/>
+        <w:numPr>
+          <w:ilvl w:val="0"/>
+          <w:numId w:val="1"/>
+        </w:numPr>
+        <w:spacing w:after="100" w:line="276" w:lineRule="auto"/>
+        <w:jc w:val="both"/>
+      </w:pPr>
+      <w:r>
+        <w:rPr>
+          <w:rFonts w:ascii="Times New Roman" w:cs="Times New Roman" w:eastAsia="Times New Roman" w:hAnsi="Times New Roman"/>
+          <w:sz w:val="24"/>
+          <w:szCs w:val="24"/>
+        </w:rPr>
+        <w:t xml:space="preserve">Asynchronous state management: coexistence of polling, scroll pagination and timeframe switching required the use of mutable refs (useRef) and a pollInFlightRef guard to avoid race conditions.</w:t>
       </w:r>
     </w:p>
     <w:p>
@@ -3575,102 +3575,102 @@
           <w:sz w:val="26"/>
           <w:szCs w:val="26"/>
         </w:rPr>
-        <w:t xml:space="preserve">5.2 Limitacoes</w:t>
-      </w:r>
-    </w:p>
-    <w:p>
-      <w:pPr>
-        <w:pStyle w:val="ListParagraph"/>
-        <w:numPr>
-          <w:ilvl w:val="0"/>
-          <w:numId w:val="1"/>
-        </w:numPr>
-        <w:spacing w:after="100" w:line="276" w:lineRule="auto"/>
-        <w:jc w:val="both"/>
-      </w:pPr>
-      <w:r>
-        <w:rPr>
-          <w:rFonts w:ascii="Times New Roman" w:cs="Times New Roman" w:eastAsia="Times New Roman" w:hAnsi="Times New Roman"/>
-          <w:sz w:val="24"/>
-          <w:szCs w:val="24"/>
-        </w:rPr>
-        <w:t xml:space="preserve">Dependencia de API nao oficial: risco de quebra sem aviso;</w:t>
-      </w:r>
-    </w:p>
-    <w:p>
-      <w:pPr>
-        <w:pStyle w:val="ListParagraph"/>
-        <w:numPr>
-          <w:ilvl w:val="0"/>
-          <w:numId w:val="1"/>
-        </w:numPr>
-        <w:spacing w:after="100" w:line="276" w:lineRule="auto"/>
-        <w:jc w:val="both"/>
-      </w:pPr>
-      <w:r>
-        <w:rPr>
-          <w:rFonts w:ascii="Times New Roman" w:cs="Times New Roman" w:eastAsia="Times New Roman" w:hAnsi="Times New Roman"/>
-          <w:sz w:val="24"/>
-          <w:szCs w:val="24"/>
-        </w:rPr>
-        <w:t xml:space="preserve">Conjunto fixo de ativos: limitado a seis tickers predefinidos;</w:t>
-      </w:r>
-    </w:p>
-    <w:p>
-      <w:pPr>
-        <w:pStyle w:val="ListParagraph"/>
-        <w:numPr>
-          <w:ilvl w:val="0"/>
-          <w:numId w:val="1"/>
-        </w:numPr>
-        <w:spacing w:after="100" w:line="276" w:lineRule="auto"/>
-        <w:jc w:val="both"/>
-      </w:pPr>
-      <w:r>
-        <w:rPr>
-          <w:rFonts w:ascii="Times New Roman" w:cs="Times New Roman" w:eastAsia="Times New Roman" w:hAnsi="Times New Roman"/>
-          <w:sz w:val="24"/>
-          <w:szCs w:val="24"/>
-        </w:rPr>
-        <w:t xml:space="preserve">Polling vs. tempo real: latencia de ate 15 segundos comparativamente a WebSocket;</w:t>
-      </w:r>
-    </w:p>
-    <w:p>
-      <w:pPr>
-        <w:pStyle w:val="ListParagraph"/>
-        <w:numPr>
-          <w:ilvl w:val="0"/>
-          <w:numId w:val="1"/>
-        </w:numPr>
-        <w:spacing w:after="100" w:line="276" w:lineRule="auto"/>
-        <w:jc w:val="both"/>
-      </w:pPr>
-      <w:r>
-        <w:rPr>
-          <w:rFonts w:ascii="Times New Roman" w:cs="Times New Roman" w:eastAsia="Times New Roman" w:hAnsi="Times New Roman"/>
-          <w:sz w:val="24"/>
-          <w:szCs w:val="24"/>
-        </w:rPr>
-        <w:t xml:space="preserve">Ausencia de persistencia: sem autenticacao, perfis ou gestao de portfolio;</w:t>
-      </w:r>
-    </w:p>
-    <w:p>
-      <w:pPr>
-        <w:pStyle w:val="ListParagraph"/>
-        <w:numPr>
-          <w:ilvl w:val="0"/>
-          <w:numId w:val="1"/>
-        </w:numPr>
-        <w:spacing w:after="100" w:line="276" w:lineRule="auto"/>
-        <w:jc w:val="both"/>
-      </w:pPr>
-      <w:r>
-        <w:rPr>
-          <w:rFonts w:ascii="Times New Roman" w:cs="Times New Roman" w:eastAsia="Times New Roman" w:hAnsi="Times New Roman"/>
-          <w:sz w:val="24"/>
-          <w:szCs w:val="24"/>
-        </w:rPr>
-        <w:t xml:space="preserve">Dados historicos limitados por intervalo: a API restringe dados de 1 minuto aos ultimos 7 dias.</w:t>
+        <w:t xml:space="preserve">5.2 Limitations</w:t>
+      </w:r>
+    </w:p>
+    <w:p>
+      <w:pPr>
+        <w:pStyle w:val="ListParagraph"/>
+        <w:numPr>
+          <w:ilvl w:val="0"/>
+          <w:numId w:val="1"/>
+        </w:numPr>
+        <w:spacing w:after="100" w:line="276" w:lineRule="auto"/>
+        <w:jc w:val="both"/>
+      </w:pPr>
+      <w:r>
+        <w:rPr>
+          <w:rFonts w:ascii="Times New Roman" w:cs="Times New Roman" w:eastAsia="Times New Roman" w:hAnsi="Times New Roman"/>
+          <w:sz w:val="24"/>
+          <w:szCs w:val="24"/>
+        </w:rPr>
+        <w:t xml:space="preserve">Unofficial API dependency: risk of breaking without notice;</w:t>
+      </w:r>
+    </w:p>
+    <w:p>
+      <w:pPr>
+        <w:pStyle w:val="ListParagraph"/>
+        <w:numPr>
+          <w:ilvl w:val="0"/>
+          <w:numId w:val="1"/>
+        </w:numPr>
+        <w:spacing w:after="100" w:line="276" w:lineRule="auto"/>
+        <w:jc w:val="both"/>
+      </w:pPr>
+      <w:r>
+        <w:rPr>
+          <w:rFonts w:ascii="Times New Roman" w:cs="Times New Roman" w:eastAsia="Times New Roman" w:hAnsi="Times New Roman"/>
+          <w:sz w:val="24"/>
+          <w:szCs w:val="24"/>
+        </w:rPr>
+        <w:t xml:space="preserve">Fixed asset set: limited to six predefined tickers;</w:t>
+      </w:r>
+    </w:p>
+    <w:p>
+      <w:pPr>
+        <w:pStyle w:val="ListParagraph"/>
+        <w:numPr>
+          <w:ilvl w:val="0"/>
+          <w:numId w:val="1"/>
+        </w:numPr>
+        <w:spacing w:after="100" w:line="276" w:lineRule="auto"/>
+        <w:jc w:val="both"/>
+      </w:pPr>
+      <w:r>
+        <w:rPr>
+          <w:rFonts w:ascii="Times New Roman" w:cs="Times New Roman" w:eastAsia="Times New Roman" w:hAnsi="Times New Roman"/>
+          <w:sz w:val="24"/>
+          <w:szCs w:val="24"/>
+        </w:rPr>
+        <w:t xml:space="preserve">Polling vs real-time: up to 15 seconds of latency compared to WebSocket;</w:t>
+      </w:r>
+    </w:p>
+    <w:p>
+      <w:pPr>
+        <w:pStyle w:val="ListParagraph"/>
+        <w:numPr>
+          <w:ilvl w:val="0"/>
+          <w:numId w:val="1"/>
+        </w:numPr>
+        <w:spacing w:after="100" w:line="276" w:lineRule="auto"/>
+        <w:jc w:val="both"/>
+      </w:pPr>
+      <w:r>
+        <w:rPr>
+          <w:rFonts w:ascii="Times New Roman" w:cs="Times New Roman" w:eastAsia="Times New Roman" w:hAnsi="Times New Roman"/>
+          <w:sz w:val="24"/>
+          <w:szCs w:val="24"/>
+        </w:rPr>
+        <w:t xml:space="preserve">No persistence: no authentication, profiles, or portfolio management;</w:t>
+      </w:r>
+    </w:p>
+    <w:p>
+      <w:pPr>
+        <w:pStyle w:val="ListParagraph"/>
+        <w:numPr>
+          <w:ilvl w:val="0"/>
+          <w:numId w:val="1"/>
+        </w:numPr>
+        <w:spacing w:after="100" w:line="276" w:lineRule="auto"/>
+        <w:jc w:val="both"/>
+      </w:pPr>
+      <w:r>
+        <w:rPr>
+          <w:rFonts w:ascii="Times New Roman" w:cs="Times New Roman" w:eastAsia="Times New Roman" w:hAnsi="Times New Roman"/>
+          <w:sz w:val="24"/>
+          <w:szCs w:val="24"/>
+        </w:rPr>
+        <w:t xml:space="preserve">Limited historical data by interval: the API restricts 1-minute data to the last 7 days.</w:t>
       </w:r>
     </w:p>
     <w:p>
@@ -3686,121 +3686,121 @@
           <w:sz w:val="26"/>
           <w:szCs w:val="26"/>
         </w:rPr>
-        <w:t xml:space="preserve">5.3 Alternativas e Melhorias</w:t>
-      </w:r>
-    </w:p>
-    <w:p>
-      <w:pPr>
-        <w:pStyle w:val="ListParagraph"/>
-        <w:numPr>
-          <w:ilvl w:val="0"/>
-          <w:numId w:val="1"/>
-        </w:numPr>
-        <w:spacing w:after="100" w:line="276" w:lineRule="auto"/>
-        <w:jc w:val="both"/>
-      </w:pPr>
-      <w:r>
-        <w:rPr>
-          <w:rFonts w:ascii="Times New Roman" w:cs="Times New Roman" w:eastAsia="Times New Roman" w:hAnsi="Times New Roman"/>
-          <w:sz w:val="24"/>
-          <w:szCs w:val="24"/>
-        </w:rPr>
-        <w:t xml:space="preserve">WebSocket ou Server-Sent Events para atualizacoes genuinamente em tempo real;</w:t>
-      </w:r>
-    </w:p>
-    <w:p>
-      <w:pPr>
-        <w:pStyle w:val="ListParagraph"/>
-        <w:numPr>
-          <w:ilvl w:val="0"/>
-          <w:numId w:val="1"/>
-        </w:numPr>
-        <w:spacing w:after="100" w:line="276" w:lineRule="auto"/>
-        <w:jc w:val="both"/>
-      </w:pPr>
-      <w:r>
-        <w:rPr>
-          <w:rFonts w:ascii="Times New Roman" w:cs="Times New Roman" w:eastAsia="Times New Roman" w:hAnsi="Times New Roman"/>
-          <w:sz w:val="24"/>
-          <w:szCs w:val="24"/>
-        </w:rPr>
-        <w:t xml:space="preserve">API oficial (Polygon.io, Finnhub) para maior fiabilidade e historico mais extenso;</w:t>
-      </w:r>
-    </w:p>
-    <w:p>
-      <w:pPr>
-        <w:pStyle w:val="ListParagraph"/>
-        <w:numPr>
-          <w:ilvl w:val="0"/>
-          <w:numId w:val="1"/>
-        </w:numPr>
-        <w:spacing w:after="100" w:line="276" w:lineRule="auto"/>
-        <w:jc w:val="both"/>
-      </w:pPr>
-      <w:r>
-        <w:rPr>
-          <w:rFonts w:ascii="Times New Roman" w:cs="Times New Roman" w:eastAsia="Times New Roman" w:hAnsi="Times New Roman"/>
-          <w:sz w:val="24"/>
-          <w:szCs w:val="24"/>
-        </w:rPr>
-        <w:t xml:space="preserve">Suporte a pesquisa de qualquer ticker e adicao dinamica de ativos;</w:t>
-      </w:r>
-    </w:p>
-    <w:p>
-      <w:pPr>
-        <w:pStyle w:val="ListParagraph"/>
-        <w:numPr>
-          <w:ilvl w:val="0"/>
-          <w:numId w:val="1"/>
-        </w:numPr>
-        <w:spacing w:after="100" w:line="276" w:lineRule="auto"/>
-        <w:jc w:val="both"/>
-      </w:pPr>
-      <w:r>
-        <w:rPr>
-          <w:rFonts w:ascii="Times New Roman" w:cs="Times New Roman" w:eastAsia="Times New Roman" w:hAnsi="Times New Roman"/>
-          <w:sz w:val="24"/>
-          <w:szCs w:val="24"/>
-        </w:rPr>
-        <w:t xml:space="preserve">Indicadores adicionais: RSI, MACD, Estocastico;</w:t>
-      </w:r>
-    </w:p>
-    <w:p>
-      <w:pPr>
-        <w:pStyle w:val="ListParagraph"/>
-        <w:numPr>
-          <w:ilvl w:val="0"/>
-          <w:numId w:val="1"/>
-        </w:numPr>
-        <w:spacing w:after="100" w:line="276" w:lineRule="auto"/>
-        <w:jc w:val="both"/>
-      </w:pPr>
-      <w:r>
-        <w:rPr>
-          <w:rFonts w:ascii="Times New Roman" w:cs="Times New Roman" w:eastAsia="Times New Roman" w:hAnsi="Times New Roman"/>
-          <w:sz w:val="24"/>
-          <w:szCs w:val="24"/>
-        </w:rPr>
-        <w:t xml:space="preserve">Autenticacao e gestao de portfolio com alertas de preco;</w:t>
-      </w:r>
-    </w:p>
-    <w:p>
-      <w:pPr>
-        <w:pStyle w:val="ListParagraph"/>
-        <w:numPr>
-          <w:ilvl w:val="0"/>
-          <w:numId w:val="1"/>
-        </w:numPr>
-        <w:spacing w:after="100" w:line="276" w:lineRule="auto"/>
-        <w:jc w:val="both"/>
-      </w:pPr>
-      <w:r>
-        <w:rPr>
-          <w:rFonts w:ascii="Times New Roman" w:cs="Times New Roman" w:eastAsia="Times New Roman" w:hAnsi="Times New Roman"/>
-          <w:sz w:val="24"/>
-          <w:szCs w:val="24"/>
-        </w:rPr>
-        <w:t xml:space="preserve">Testes automatizados (Vitest + Playwright) para garantir estabilidade.</w:t>
+        <w:t xml:space="preserve">5.3 Alternatives and Improvements</w:t>
+      </w:r>
+    </w:p>
+    <w:p>
+      <w:pPr>
+        <w:pStyle w:val="ListParagraph"/>
+        <w:numPr>
+          <w:ilvl w:val="0"/>
+          <w:numId w:val="1"/>
+        </w:numPr>
+        <w:spacing w:after="100" w:line="276" w:lineRule="auto"/>
+        <w:jc w:val="both"/>
+      </w:pPr>
+      <w:r>
+        <w:rPr>
+          <w:rFonts w:ascii="Times New Roman" w:cs="Times New Roman" w:eastAsia="Times New Roman" w:hAnsi="Times New Roman"/>
+          <w:sz w:val="24"/>
+          <w:szCs w:val="24"/>
+        </w:rPr>
+        <w:t xml:space="preserve">WebSocket or Server-Sent Events for genuinely real-time updates;</w:t>
+      </w:r>
+    </w:p>
+    <w:p>
+      <w:pPr>
+        <w:pStyle w:val="ListParagraph"/>
+        <w:numPr>
+          <w:ilvl w:val="0"/>
+          <w:numId w:val="1"/>
+        </w:numPr>
+        <w:spacing w:after="100" w:line="276" w:lineRule="auto"/>
+        <w:jc w:val="both"/>
+      </w:pPr>
+      <w:r>
+        <w:rPr>
+          <w:rFonts w:ascii="Times New Roman" w:cs="Times New Roman" w:eastAsia="Times New Roman" w:hAnsi="Times New Roman"/>
+          <w:sz w:val="24"/>
+          <w:szCs w:val="24"/>
+        </w:rPr>
+        <w:t xml:space="preserve">Official API (Polygon.io, Finnhub) for greater reliability and more extensive historical data;</w:t>
+      </w:r>
+    </w:p>
+    <w:p>
+      <w:pPr>
+        <w:pStyle w:val="ListParagraph"/>
+        <w:numPr>
+          <w:ilvl w:val="0"/>
+          <w:numId w:val="1"/>
+        </w:numPr>
+        <w:spacing w:after="100" w:line="276" w:lineRule="auto"/>
+        <w:jc w:val="both"/>
+      </w:pPr>
+      <w:r>
+        <w:rPr>
+          <w:rFonts w:ascii="Times New Roman" w:cs="Times New Roman" w:eastAsia="Times New Roman" w:hAnsi="Times New Roman"/>
+          <w:sz w:val="24"/>
+          <w:szCs w:val="24"/>
+        </w:rPr>
+        <w:t xml:space="preserve">Support for searching any ticker and dynamically adding assets;</w:t>
+      </w:r>
+    </w:p>
+    <w:p>
+      <w:pPr>
+        <w:pStyle w:val="ListParagraph"/>
+        <w:numPr>
+          <w:ilvl w:val="0"/>
+          <w:numId w:val="1"/>
+        </w:numPr>
+        <w:spacing w:after="100" w:line="276" w:lineRule="auto"/>
+        <w:jc w:val="both"/>
+      </w:pPr>
+      <w:r>
+        <w:rPr>
+          <w:rFonts w:ascii="Times New Roman" w:cs="Times New Roman" w:eastAsia="Times New Roman" w:hAnsi="Times New Roman"/>
+          <w:sz w:val="24"/>
+          <w:szCs w:val="24"/>
+        </w:rPr>
+        <w:t xml:space="preserve">Additional indicators: RSI, MACD, Stochastic;</w:t>
+      </w:r>
+    </w:p>
+    <w:p>
+      <w:pPr>
+        <w:pStyle w:val="ListParagraph"/>
+        <w:numPr>
+          <w:ilvl w:val="0"/>
+          <w:numId w:val="1"/>
+        </w:numPr>
+        <w:spacing w:after="100" w:line="276" w:lineRule="auto"/>
+        <w:jc w:val="both"/>
+      </w:pPr>
+      <w:r>
+        <w:rPr>
+          <w:rFonts w:ascii="Times New Roman" w:cs="Times New Roman" w:eastAsia="Times New Roman" w:hAnsi="Times New Roman"/>
+          <w:sz w:val="24"/>
+          <w:szCs w:val="24"/>
+        </w:rPr>
+        <w:t xml:space="preserve">Authentication and portfolio management with price alerts;</w:t>
+      </w:r>
+    </w:p>
+    <w:p>
+      <w:pPr>
+        <w:pStyle w:val="ListParagraph"/>
+        <w:numPr>
+          <w:ilvl w:val="0"/>
+          <w:numId w:val="1"/>
+        </w:numPr>
+        <w:spacing w:after="100" w:line="276" w:lineRule="auto"/>
+        <w:jc w:val="both"/>
+      </w:pPr>
+      <w:r>
+        <w:rPr>
+          <w:rFonts w:ascii="Times New Roman" w:cs="Times New Roman" w:eastAsia="Times New Roman" w:hAnsi="Times New Roman"/>
+          <w:sz w:val="24"/>
+          <w:szCs w:val="24"/>
+        </w:rPr>
+        <w:t xml:space="preserve">Automated testing (Vitest + Playwright) to ensure stability.</w:t>
       </w:r>
     </w:p>
     <w:p>
@@ -3816,7 +3816,7 @@
           <w:sz w:val="26"/>
           <w:szCs w:val="26"/>
         </w:rPr>
-        <w:t xml:space="preserve">5.4 Feedback sobre o Next.js</w:t>
+        <w:t xml:space="preserve">5.4 Feedback on Next.js</w:t>
       </w:r>
     </w:p>
     <w:p>
@@ -3830,7 +3830,7 @@
           <w:sz w:val="24"/>
           <w:szCs w:val="24"/>
         </w:rPr>
-        <w:t xml:space="preserve">A experiencia de desenvolvimento com o Next.js revelou-se muito positiva. A separacao entre componentes de servidor e de cliente, embora inicialmente confusa, representa uma abstratcao poderosa que permite otimizacoes significativas de performance sem sacrificar a produtividade. A abordagem full-stack, com API Routes integradas, simplificou substancialmente a arquitetura do projeto, eliminando a necessidade de um servidor backend separado.</w:t>
+        <w:t xml:space="preserve">The development experience with Next.js proved to be very positive. The separation between server and client components, although initially confusing, represents a powerful abstraction that enables significant performance optimisations without sacrificing productivity. The full-stack approach, with integrated API Routes, substantially simplified the project architecture, eliminating the need for a separate backend server.</w:t>
       </w:r>
     </w:p>
     <w:p>
@@ -3844,7 +3844,7 @@
           <w:sz w:val="24"/>
           <w:szCs w:val="24"/>
         </w:rPr>
-        <w:t xml:space="preserve">A documentacao oficial e extensa e bem organizada, e a experiencia de desenvolvimento em modo de desenvolvimento (hot-reloading, mensagens de erro detalhadas) e notavelmente fluida. Em contrapartida, o App Router com React Server Components tem uma curva de aprendizagem consideravel, e a fronteira entre o que pode e o que nao pode ser feito num componente de servidor nem sempre e imediatamente obvio.</w:t>
+        <w:t xml:space="preserve">The official documentation is extensive and well organised, and the development experience in development mode (hot-reloading, detailed error messages) is remarkably smooth. On the other hand, the App Router with React Server Components has a considerable learning curve, and the boundary between what can and cannot be done in a server component is not always immediately obvious.</w:t>
       </w:r>
     </w:p>
     <w:p>
@@ -3858,7 +3858,7 @@
           <w:sz w:val="24"/>
           <w:szCs w:val="24"/>
         </w:rPr>
-        <w:t xml:space="preserve">Em suma, o Next.js revela-se uma escolha solida para aplicacoes web modernas que exijam performance, SEO e escalabilidade, com um equilibrio muito favoravel entre facilidade de uso e capacidade tecnica.</w:t>
+        <w:t xml:space="preserve">In summary, Next.js proves to be a solid choice for modern web applications that require performance, SEO, and scalability, with a very favourable balance between ease of use and technical capability.</w:t>
       </w:r>
     </w:p>
     <w:p>
@@ -3879,7 +3879,7 @@
           <w:sz w:val="28"/>
           <w:szCs w:val="28"/>
         </w:rPr>
-        <w:t xml:space="preserve">6. Bibliografia</w:t>
+        <w:t xml:space="preserve">6. Bibliography</w:t>
       </w:r>
     </w:p>
     <w:p>
@@ -3893,7 +3893,7 @@
           <w:sz w:val="24"/>
           <w:szCs w:val="24"/>
         </w:rPr>
-        <w:t xml:space="preserve">Referencias formatadas segundo a norma APA 7.a edicao.</w:t>
+        <w:t xml:space="preserve">References formatted according to the APA 7th edition standard.</w:t>
       </w:r>
     </w:p>
     <w:p>
@@ -3921,7 +3921,7 @@
           <w:sz w:val="24"/>
           <w:szCs w:val="24"/>
         </w:rPr>
-        <w:t xml:space="preserve">Fielding, R. T. (2000). Architectural styles and the design of network-based software architectures [Dissertacao de doutoramento, University of California, Irvine]. https://roy.gbiv.com/pubs/dissertation/top.htm</w:t>
+        <w:t xml:space="preserve">Fielding, R. T. (2000). Architectural styles and the design of network-based software architectures [Doctoral dissertation, University of California, Irvine]. https://roy.gbiv.com/pubs/dissertation/top.htm</w:t>
       </w:r>
     </w:p>
     <w:p>
@@ -4041,7 +4041,7 @@
           <w:sz w:val="24"/>
           <w:szCs w:val="24"/>
         </w:rPr>
-        <w:t xml:space="preserve">Yahoo Finance. (2026). Yahoo Finance – Dados de mercado financeiro. https://finance.yahoo.com</w:t>
+        <w:t xml:space="preserve">Yahoo Finance. (2026). Yahoo Finance – Financial market data. https://finance.yahoo.com</w:t>
       </w:r>
     </w:p>
     <w:sectPr>
@@ -4113,7 +4113,7 @@
         <w:sz w:val="18"/>
         <w:szCs w:val="18"/>
       </w:rPr>
-      <w:t xml:space="preserve">Pagina </w:t>
+      <w:t xml:space="preserve">Page </w:t>
     </w:r>
     <w:r>
       <w:rPr>
@@ -4134,7 +4134,7 @@
         <w:sz w:val="18"/>
         <w:szCs w:val="18"/>
       </w:rPr>
-      <w:t xml:space="preserve"> de </w:t>
+      <w:t xml:space="preserve"> of </w:t>
     </w:r>
     <w:r>
       <w:rPr>

</xml_diff>